<commit_message>
Passage panel practice on the site: builder, files, Files page card
Co-Authored-By: Claude Fable 5.1 <noreply@anthropic.com>
Claude-Session: https://claude.ai/code/session_019gyiige9BuJUj3e3kcjvaS
</commit_message>
<xml_diff>
--- a/curious-incident/files/Curious Incident - Unit Planner.docx
+++ b/curious-incident/files/Curious Incident - Unit Planner.docx
@@ -283,7 +283,7 @@
               </w:rPr>
               <w:t xml:space="preserve">use interaction skills to discuss opinions regarding texts that have different purposes and audiences, analysing how language features position an audience to respond in particular ways </w:t>
             </w:r>
-            <w:hyperlink w:history="1" r:id="rId3bzmkyvon1r005pmbtolt">
+            <w:hyperlink w:history="1" r:id="rIdsx0r-kgrdyexbstuy6ftp">
               <w:r>
                 <w:rPr>
                   <w:rFonts w:ascii="Aptos Narrow" w:cs="Aptos Narrow" w:eastAsia="Aptos Narrow" w:hAnsi="Aptos Narrow"/>
@@ -314,7 +314,7 @@
               </w:rPr>
               <w:t xml:space="preserve">deliver structured spoken texts for particular purposes, demonstrating different levels of formality in consideration of audience, using features of voice and multimodal or digital elements </w:t>
             </w:r>
-            <w:hyperlink w:history="1" r:id="rIdwd3sjyod_dwuoyvhxgwfx">
+            <w:hyperlink w:history="1" r:id="rIdmuymgwykq-rqmcolexe5l">
               <w:r>
                 <w:rPr>
                   <w:rFonts w:ascii="Aptos Narrow" w:cs="Aptos Narrow" w:eastAsia="Aptos Narrow" w:hAnsi="Aptos Narrow"/>
@@ -846,7 +846,7 @@
               </w:rPr>
               <w:t xml:space="preserve">Session 1 · Personal response (</w:t>
             </w:r>
-            <w:hyperlink w:history="1" r:id="rIdcdikuqbhr96xxkfh960_w">
+            <w:hyperlink w:history="1" r:id="rIdx3aa18gs8d9urwb34sbg7">
               <w:r>
                 <w:rPr>
                   <w:rFonts w:ascii="Aptos Narrow" w:cs="Aptos Narrow" w:eastAsia="Aptos Narrow" w:hAnsi="Aptos Narrow"/>
@@ -892,7 +892,7 @@
               </w:rPr>
               <w:t xml:space="preserve">Session 2 · I couldn't disagree more (</w:t>
             </w:r>
-            <w:hyperlink w:history="1" r:id="rIdq1kkpyazvm8uxmciryn9j">
+            <w:hyperlink w:history="1" r:id="rId80ir7-wlejrcdqpbbwffo">
               <w:r>
                 <w:rPr>
                   <w:rFonts w:ascii="Aptos Narrow" w:cs="Aptos Narrow" w:eastAsia="Aptos Narrow" w:hAnsi="Aptos Narrow"/>
@@ -938,7 +938,7 @@
               </w:rPr>
               <w:t xml:space="preserve">Session 3 · Passage analysis panel (</w:t>
             </w:r>
-            <w:hyperlink w:history="1" r:id="rId3nmwkmjpzkgnbn29zepe8">
+            <w:hyperlink w:history="1" r:id="rIdsk1ylk3kanmnteqwrtlf7">
               <w:r>
                 <w:rPr>
                   <w:rFonts w:ascii="Aptos Narrow" w:cs="Aptos Narrow" w:eastAsia="Aptos Narrow" w:hAnsi="Aptos Narrow"/>
@@ -959,7 +959,7 @@
               </w:rPr>
               <w:t xml:space="preserve">) and the completed Speaking and Listening Folio: Table 1 record on the front page, three strands, against the continuum (</w:t>
             </w:r>
-            <w:hyperlink w:history="1" r:id="rIdda9eseh5otwzmpub-w6h6">
+            <w:hyperlink w:history="1" r:id="rIdenna9lg3x5rr_5curw1nq">
               <w:r>
                 <w:rPr>
                   <w:rFonts w:ascii="Aptos Narrow" w:cs="Aptos Narrow" w:eastAsia="Aptos Narrow" w:hAnsi="Aptos Narrow"/>
@@ -980,7 +980,7 @@
               </w:rPr>
               <w:t xml:space="preserve"> · </w:t>
             </w:r>
-            <w:hyperlink w:history="1" r:id="rIdxntmofwb2h938ldo3fhaz">
+            <w:hyperlink w:history="1" r:id="rIdw2gny5ko24vgsc_5tsh-w">
               <w:r>
                 <w:rPr>
                   <w:rFonts w:ascii="Aptos Narrow" w:cs="Aptos Narrow" w:eastAsia="Aptos Narrow" w:hAnsi="Aptos Narrow"/>
@@ -1245,7 +1245,7 @@
               </w:rPr>
               <w:t xml:space="preserve">Groups made on the </w:t>
             </w:r>
-            <w:hyperlink w:history="1" r:id="rIdiykb7fv899qquz3kvbybg">
+            <w:hyperlink w:history="1" r:id="rId-l2meecj8frrrdyyzq9te">
               <w:r>
                 <w:rPr>
                   <w:rFonts w:ascii="Aptos Narrow" w:cs="Aptos Narrow" w:eastAsia="Aptos Narrow" w:hAnsi="Aptos Narrow"/>
@@ -1266,7 +1266,7 @@
               </w:rPr>
               <w:t xml:space="preserve">. Folio handed out, one per student; front page explained once. </w:t>
             </w:r>
-            <w:hyperlink w:history="1" r:id="rIdy2i6bt-n3o1jzduoaptvc">
+            <w:hyperlink w:history="1" r:id="rIdwpb5nwntpzxyg4wqdexfd">
               <w:r>
                 <w:rPr>
                   <w:rFonts w:ascii="Aptos Narrow" w:cs="Aptos Narrow" w:eastAsia="Aptos Narrow" w:hAnsi="Aptos Narrow"/>
@@ -1292,7 +1292,7 @@
               </w:rPr>
               <w:t xml:space="preserve">Sentence starters pre-taught as a script: </w:t>
             </w:r>
-            <w:hyperlink w:history="1" r:id="rIdjoqizh_qn-ghz_nbr9xii">
+            <w:hyperlink w:history="1" r:id="rId33qpf094psil5lnw6qd2f">
               <w:r>
                 <w:rPr>
                   <w:rFonts w:ascii="Aptos Narrow" w:cs="Aptos Narrow" w:eastAsia="Aptos Narrow" w:hAnsi="Aptos Narrow"/>
@@ -1318,7 +1318,7 @@
               </w:rPr>
               <w:t xml:space="preserve">Key vocabulary: </w:t>
             </w:r>
-            <w:hyperlink w:history="1" r:id="rIdfdmukitftvs4q7xxkbbv_">
+            <w:hyperlink w:history="1" r:id="rId-bu8iq3vm8abhnqdbtmqv">
               <w:r>
                 <w:rPr>
                   <w:rFonts w:ascii="Aptos Narrow" w:cs="Aptos Narrow" w:eastAsia="Aptos Narrow" w:hAnsi="Aptos Narrow"/>
@@ -1344,7 +1344,7 @@
               </w:rPr>
               <w:t xml:space="preserve">Teacher notes: </w:t>
             </w:r>
-            <w:hyperlink w:history="1" r:id="rId-qagazezpkp7t4fx1nhbt">
+            <w:hyperlink w:history="1" r:id="rIdr49pvuhgfugbjyuokoh6t">
               <w:r>
                 <w:rPr>
                   <w:rFonts w:ascii="Aptos Narrow" w:cs="Aptos Narrow" w:eastAsia="Aptos Narrow" w:hAnsi="Aptos Narrow"/>
@@ -1479,7 +1479,7 @@
               </w:rPr>
               <w:t xml:space="preserve"> · </w:t>
             </w:r>
-            <w:hyperlink w:history="1" r:id="rIdmhhryx1wegsqa4efvb4mw">
+            <w:hyperlink w:history="1" r:id="rIdp-eiqedfxkqbq7nsfe_lh">
               <w:r>
                 <w:rPr>
                   <w:rFonts w:ascii="Aptos Narrow" w:cs="Aptos Narrow" w:eastAsia="Aptos Narrow" w:hAnsi="Aptos Narrow"/>
@@ -1500,7 +1500,7 @@
               </w:rPr>
               <w:t xml:space="preserve"> · </w:t>
             </w:r>
-            <w:hyperlink w:history="1" r:id="rIds3m40wala47g18kbgb9eu">
+            <w:hyperlink w:history="1" r:id="rIde9njngt4kgu_thwqw-qt6">
               <w:r>
                 <w:rPr>
                   <w:rFonts w:ascii="Aptos Narrow" w:cs="Aptos Narrow" w:eastAsia="Aptos Narrow" w:hAnsi="Aptos Narrow"/>
@@ -1521,7 +1521,7 @@
               </w:rPr>
               <w:t xml:space="preserve"> · </w:t>
             </w:r>
-            <w:hyperlink w:history="1" r:id="rIdxgjtav0s39ur5okch_yvd">
+            <w:hyperlink w:history="1" r:id="rId0-g4qvis4sn4__eh5pnkm">
               <w:r>
                 <w:rPr>
                   <w:rFonts w:ascii="Aptos Narrow" w:cs="Aptos Narrow" w:eastAsia="Aptos Narrow" w:hAnsi="Aptos Narrow"/>
@@ -1631,7 +1631,7 @@
               </w:rPr>
               <w:t xml:space="preserve">Table 1 record returned, one line of feedback each. Table talk Session 1 at level 9 and 11 on the screen, five minutes: </w:t>
             </w:r>
-            <w:hyperlink w:history="1" r:id="rIdinq-afndy7dhxhs9qoytj">
+            <w:hyperlink w:history="1" r:id="rIdphdse1mrfa2ctafnlipry">
               <w:r>
                 <w:rPr>
                   <w:rFonts w:ascii="Aptos Narrow" w:cs="Aptos Narrow" w:eastAsia="Aptos Narrow" w:hAnsi="Aptos Narrow"/>
@@ -1766,7 +1766,7 @@
               </w:rPr>
               <w:t xml:space="preserve"> · </w:t>
             </w:r>
-            <w:hyperlink w:history="1" r:id="rIdv_-c9_bwcqncifu-29llu">
+            <w:hyperlink w:history="1" r:id="rIdvryqs-rqutd16ekxoq14g">
               <w:r>
                 <w:rPr>
                   <w:rFonts w:ascii="Aptos Narrow" w:cs="Aptos Narrow" w:eastAsia="Aptos Narrow" w:hAnsi="Aptos Narrow"/>
@@ -1787,7 +1787,7 @@
               </w:rPr>
               <w:t xml:space="preserve"> · </w:t>
             </w:r>
-            <w:hyperlink w:history="1" r:id="rIdojrlisvbirx2mias22lsb">
+            <w:hyperlink w:history="1" r:id="rIdd2afvyfxdgfyjgzzb_uzg">
               <w:r>
                 <w:rPr>
                   <w:rFonts w:ascii="Aptos Narrow" w:cs="Aptos Narrow" w:eastAsia="Aptos Narrow" w:hAnsi="Aptos Narrow"/>
@@ -1808,7 +1808,7 @@
               </w:rPr>
               <w:t xml:space="preserve"> · </w:t>
             </w:r>
-            <w:hyperlink w:history="1" r:id="rIdzekm2etooqup4adm-rzdy">
+            <w:hyperlink w:history="1" r:id="rIdanrak4wqhvmjgo-ay1n-0">
               <w:r>
                 <w:rPr>
                   <w:rFonts w:ascii="Aptos Narrow" w:cs="Aptos Narrow" w:eastAsia="Aptos Narrow" w:hAnsi="Aptos Narrow"/>
@@ -1884,7 +1884,21 @@
                 <w:sz w:val="20"/>
                 <w:szCs w:val="20"/>
               </w:rPr>
-              <w:t xml:space="preserve">To use my voice and register appropriately in different contexts (Interacting 8)</w:t>
+              <w:t xml:space="preserve">To use active listening skills</w:t>
+            </w:r>
+          </w:p>
+          <w:p>
+            <w:pPr>
+              <w:spacing w:after="20" w:before="0"/>
+            </w:pPr>
+            <w:r>
+              <w:rPr>
+                <w:rFonts w:ascii="Aptos Narrow" w:cs="Aptos Narrow" w:eastAsia="Aptos Narrow" w:hAnsi="Aptos Narrow"/>
+                <w:color w:val="1F1F1F"/>
+                <w:sz w:val="20"/>
+                <w:szCs w:val="20"/>
+              </w:rPr>
+              <w:t xml:space="preserve">To share my interpretations, ideas and opinions in a group discussion</w:t>
             </w:r>
           </w:p>
         </w:tc>
@@ -1916,8 +1930,87 @@
                 <w:sz w:val="20"/>
                 <w:szCs w:val="20"/>
               </w:rPr>
-              <w:t xml:space="preserve">Table 1 record returned. The Reader role again with a throwaway statement, five minutes.</w:t>
-            </w:r>
+              <w:t xml:space="preserve">Table 1 record returned.</w:t>
+            </w:r>
+          </w:p>
+          <w:p>
+            <w:pPr>
+              <w:spacing w:after="20" w:before="0"/>
+            </w:pPr>
+            <w:r>
+              <w:rPr>
+                <w:rFonts w:ascii="Aptos Narrow" w:cs="Aptos Narrow" w:eastAsia="Aptos Narrow" w:hAnsi="Aptos Narrow"/>
+                <w:b/>
+                <w:bCs/>
+                <w:color w:val="1F1F1F"/>
+                <w:sz w:val="20"/>
+                <w:szCs w:val="20"/>
+              </w:rPr>
+              <w:t xml:space="preserve">Passage panel practice</w:t>
+            </w:r>
+            <w:r>
+              <w:rPr>
+                <w:rFonts w:ascii="Aptos Narrow" w:cs="Aptos Narrow" w:eastAsia="Aptos Narrow" w:hAnsi="Aptos Narrow"/>
+                <w:color w:val="1F1F1F"/>
+                <w:sz w:val="20"/>
+                <w:szCs w:val="20"/>
+              </w:rPr>
+              <w:t xml:space="preserve"> (one period): the opening passage, the three panel questions, 'yes, and'. </w:t>
+            </w:r>
+            <w:hyperlink w:history="1" r:id="rIdhjvpvf0pb7jloe7krdbge">
+              <w:r>
+                <w:rPr>
+                  <w:rFonts w:ascii="Aptos Narrow" w:cs="Aptos Narrow" w:eastAsia="Aptos Narrow" w:hAnsi="Aptos Narrow"/>
+                  <w:color w:val="0563C1"/>
+                  <w:sz w:val="20"/>
+                  <w:szCs w:val="20"/>
+                  <w:u w:val="single"/>
+                </w:rPr>
+                <w:t xml:space="preserve">Lesson plan 3a</w:t>
+              </w:r>
+            </w:hyperlink>
+            <w:r>
+              <w:rPr>
+                <w:rFonts w:ascii="Aptos Narrow" w:cs="Aptos Narrow" w:eastAsia="Aptos Narrow" w:hAnsi="Aptos Narrow"/>
+                <w:color w:val="1F1F1F"/>
+                <w:sz w:val="20"/>
+                <w:szCs w:val="20"/>
+              </w:rPr>
+              <w:t xml:space="preserve"> · </w:t>
+            </w:r>
+            <w:hyperlink w:history="1" r:id="rIdhqlzho3llyx-w9vxnpbsq">
+              <w:r>
+                <w:rPr>
+                  <w:rFonts w:ascii="Aptos Narrow" w:cs="Aptos Narrow" w:eastAsia="Aptos Narrow" w:hAnsi="Aptos Narrow"/>
+                  <w:color w:val="0563C1"/>
+                  <w:sz w:val="20"/>
+                  <w:szCs w:val="20"/>
+                  <w:u w:val="single"/>
+                </w:rPr>
+                <w:t xml:space="preserve">Panel practice worksheet</w:t>
+              </w:r>
+            </w:hyperlink>
+            <w:r>
+              <w:rPr>
+                <w:rFonts w:ascii="Aptos Narrow" w:cs="Aptos Narrow" w:eastAsia="Aptos Narrow" w:hAnsi="Aptos Narrow"/>
+                <w:color w:val="1F1F1F"/>
+                <w:sz w:val="20"/>
+                <w:szCs w:val="20"/>
+              </w:rPr>
+              <w:t xml:space="preserve"> · </w:t>
+            </w:r>
+            <w:hyperlink w:history="1" r:id="rIdbt4binmd2_itwigqvow3k">
+              <w:r>
+                <w:rPr>
+                  <w:rFonts w:ascii="Aptos Narrow" w:cs="Aptos Narrow" w:eastAsia="Aptos Narrow" w:hAnsi="Aptos Narrow"/>
+                  <w:color w:val="0563C1"/>
+                  <w:sz w:val="20"/>
+                  <w:szCs w:val="20"/>
+                  <w:u w:val="single"/>
+                </w:rPr>
+                <w:t xml:space="preserve">Table talk · Session 3</w:t>
+              </w:r>
+            </w:hyperlink>
           </w:p>
         </w:tc>
       </w:tr>
@@ -2041,7 +2134,7 @@
               </w:rPr>
               <w:t xml:space="preserve"> · </w:t>
             </w:r>
-            <w:hyperlink w:history="1" r:id="rIdz1hwiz84xpfoudllmdi7v">
+            <w:hyperlink w:history="1" r:id="rIdnbvc3zpkwmufduqfvlqab">
               <w:r>
                 <w:rPr>
                   <w:rFonts w:ascii="Aptos Narrow" w:cs="Aptos Narrow" w:eastAsia="Aptos Narrow" w:hAnsi="Aptos Narrow"/>
@@ -2062,7 +2155,7 @@
               </w:rPr>
               <w:t xml:space="preserve"> · </w:t>
             </w:r>
-            <w:hyperlink w:history="1" r:id="rIdkixrmpme6ls-hhuxctu3j">
+            <w:hyperlink w:history="1" r:id="rIdvphjhn1i3neqbq3txfo_c">
               <w:r>
                 <w:rPr>
                   <w:rFonts w:ascii="Aptos Narrow" w:cs="Aptos Narrow" w:eastAsia="Aptos Narrow" w:hAnsi="Aptos Narrow"/>
@@ -2083,7 +2176,7 @@
               </w:rPr>
               <w:t xml:space="preserve"> · </w:t>
             </w:r>
-            <w:hyperlink w:history="1" r:id="rIdwlg3-pdni__ojxy-qon4g">
+            <w:hyperlink w:history="1" r:id="rIdyh5--1krkrve_iqgbiyls">
               <w:r>
                 <w:rPr>
                   <w:rFonts w:ascii="Aptos Narrow" w:cs="Aptos Narrow" w:eastAsia="Aptos Narrow" w:hAnsi="Aptos Narrow"/>
@@ -2109,7 +2202,7 @@
               </w:rPr>
               <w:t xml:space="preserve">Folio collected and scored against the </w:t>
             </w:r>
-            <w:hyperlink w:history="1" r:id="rIddzjo3gujijnvqn8xt7tsa">
+            <w:hyperlink w:history="1" r:id="rIdlbtpqmx8epqftuhhq_ut9">
               <w:r>
                 <w:rPr>
                   <w:rFonts w:ascii="Aptos Narrow" w:cs="Aptos Narrow" w:eastAsia="Aptos Narrow" w:hAnsi="Aptos Narrow"/>
@@ -2130,7 +2223,7 @@
               </w:rPr>
               <w:t xml:space="preserve">. Feeds into the Reading and Viewing unit's close analysis (</w:t>
             </w:r>
-            <w:hyperlink w:history="1" r:id="rIdifjgradus3b88dm7cd77q">
+            <w:hyperlink w:history="1" r:id="rIdzz1o3ye2pgnjxw7s5rgoj">
               <w:r>
                 <w:rPr>
                   <w:rFonts w:ascii="Aptos Narrow" w:cs="Aptos Narrow" w:eastAsia="Aptos Narrow" w:hAnsi="Aptos Narrow"/>
@@ -2170,7 +2263,7 @@
         </w:rPr>
         <w:t xml:space="preserve">Everything in one place: </w:t>
       </w:r>
-      <w:hyperlink w:history="1" r:id="rId3bn5xhaqz6epyptwio99h">
+      <w:hyperlink w:history="1" r:id="rId9jt51pgf92-hdl4llyd2h">
         <w:r>
           <w:rPr>
             <w:rFonts w:ascii="Aptos Narrow" w:cs="Aptos Narrow" w:eastAsia="Aptos Narrow" w:hAnsi="Aptos Narrow"/>
@@ -2191,7 +2284,7 @@
         </w:rPr>
         <w:t xml:space="preserve"> · </w:t>
       </w:r>
-      <w:hyperlink w:history="1" r:id="rIdlefvaib40tcttvbpnhofd">
+      <w:hyperlink w:history="1" r:id="rId7eravlndcyrmaxfrghaed">
         <w:r>
           <w:rPr>
             <w:rFonts w:ascii="Aptos Narrow" w:cs="Aptos Narrow" w:eastAsia="Aptos Narrow" w:hAnsi="Aptos Narrow"/>
@@ -2212,7 +2305,7 @@
         </w:rPr>
         <w:t xml:space="preserve"> · </w:t>
       </w:r>
-      <w:hyperlink w:history="1" r:id="rIdw6rkbgt6ikmg0txqgkcyh">
+      <w:hyperlink w:history="1" r:id="rId_wlaiwjyx8t_4mc8jlbmr">
         <w:r>
           <w:rPr>
             <w:rFonts w:ascii="Aptos Narrow" w:cs="Aptos Narrow" w:eastAsia="Aptos Narrow" w:hAnsi="Aptos Narrow"/>

</xml_diff>

<commit_message>
My glossary: core vocab block, build-the-word step, vocab page folded in
Co-Authored-By: Claude Fable 5.1 <noreply@anthropic.com>
Claude-Session: https://claude.ai/code/session_019gyiige9BuJUj3e3kcjvaS
</commit_message>
<xml_diff>
--- a/curious-incident/files/Curious Incident - Unit Planner.docx
+++ b/curious-incident/files/Curious Incident - Unit Planner.docx
@@ -283,7 +283,7 @@
               </w:rPr>
               <w:t xml:space="preserve">use interaction skills to discuss opinions regarding texts that have different purposes and audiences, analysing how language features position an audience to respond in particular ways </w:t>
             </w:r>
-            <w:hyperlink w:history="1" r:id="rIdulydztg_8a1lhmmb2da5i">
+            <w:hyperlink w:history="1" r:id="rIdakhhkyubrdvbff6ny8fex">
               <w:r>
                 <w:rPr>
                   <w:rFonts w:ascii="Aptos Narrow" w:cs="Aptos Narrow" w:eastAsia="Aptos Narrow" w:hAnsi="Aptos Narrow"/>
@@ -314,7 +314,7 @@
               </w:rPr>
               <w:t xml:space="preserve">deliver structured spoken texts for particular purposes, demonstrating different levels of formality in consideration of audience, using features of voice and multimodal or digital elements </w:t>
             </w:r>
-            <w:hyperlink w:history="1" r:id="rIdn-ionxh4e7tgm-pyjummd">
+            <w:hyperlink w:history="1" r:id="rIdy4xxhl_wbi3aimkka2wau">
               <w:r>
                 <w:rPr>
                   <w:rFonts w:ascii="Aptos Narrow" w:cs="Aptos Narrow" w:eastAsia="Aptos Narrow" w:hAnsi="Aptos Narrow"/>
@@ -846,7 +846,7 @@
               </w:rPr>
               <w:t xml:space="preserve">Session 1 · Personal response (</w:t>
             </w:r>
-            <w:hyperlink w:history="1" r:id="rIdmc5izyw7mih9qz2s5jmwp">
+            <w:hyperlink w:history="1" r:id="rIdpobcilxlvlxk57a_sr1th">
               <w:r>
                 <w:rPr>
                   <w:rFonts w:ascii="Aptos Narrow" w:cs="Aptos Narrow" w:eastAsia="Aptos Narrow" w:hAnsi="Aptos Narrow"/>
@@ -892,7 +892,7 @@
               </w:rPr>
               <w:t xml:space="preserve">Session 2 · I couldn't disagree more (</w:t>
             </w:r>
-            <w:hyperlink w:history="1" r:id="rId009rloru3u-vnc02trzxh">
+            <w:hyperlink w:history="1" r:id="rId09n38qbisltj8snra14vt">
               <w:r>
                 <w:rPr>
                   <w:rFonts w:ascii="Aptos Narrow" w:cs="Aptos Narrow" w:eastAsia="Aptos Narrow" w:hAnsi="Aptos Narrow"/>
@@ -938,7 +938,7 @@
               </w:rPr>
               <w:t xml:space="preserve">Session 3 · Passage analysis panel (</w:t>
             </w:r>
-            <w:hyperlink w:history="1" r:id="rIdaomjryz8s-rlcdhe9q3cl">
+            <w:hyperlink w:history="1" r:id="rId238aujzrt9puwywjqobuj">
               <w:r>
                 <w:rPr>
                   <w:rFonts w:ascii="Aptos Narrow" w:cs="Aptos Narrow" w:eastAsia="Aptos Narrow" w:hAnsi="Aptos Narrow"/>
@@ -959,7 +959,7 @@
               </w:rPr>
               <w:t xml:space="preserve">) and the completed Speaking and Listening Folio: Table 1 record on the front page, three strands, against the continuum (</w:t>
             </w:r>
-            <w:hyperlink w:history="1" r:id="rIdfwlqnvunvxqatcsku4dua">
+            <w:hyperlink w:history="1" r:id="rIdjvfw4dlk7wbisvvqh6bbh">
               <w:r>
                 <w:rPr>
                   <w:rFonts w:ascii="Aptos Narrow" w:cs="Aptos Narrow" w:eastAsia="Aptos Narrow" w:hAnsi="Aptos Narrow"/>
@@ -980,7 +980,7 @@
               </w:rPr>
               <w:t xml:space="preserve"> · </w:t>
             </w:r>
-            <w:hyperlink w:history="1" r:id="rId1eqoxjyxs7yxvs9nin9pq">
+            <w:hyperlink w:history="1" r:id="rIdjtl3dllzzkyuf_gx4vi3v">
               <w:r>
                 <w:rPr>
                   <w:rFonts w:ascii="Aptos Narrow" w:cs="Aptos Narrow" w:eastAsia="Aptos Narrow" w:hAnsi="Aptos Narrow"/>
@@ -1232,7 +1232,7 @@
               </w:rPr>
               <w:t xml:space="preserve">Groups made on the </w:t>
             </w:r>
-            <w:hyperlink w:history="1" r:id="rId7eeqsxclhie0l-bcckhzm">
+            <w:hyperlink w:history="1" r:id="rIdwxa_kv47tdrxzg36uocnq">
               <w:r>
                 <w:rPr>
                   <w:rFonts w:ascii="Aptos Narrow" w:cs="Aptos Narrow" w:eastAsia="Aptos Narrow" w:hAnsi="Aptos Narrow"/>
@@ -1253,7 +1253,7 @@
               </w:rPr>
               <w:t xml:space="preserve">. Folio handed out: </w:t>
             </w:r>
-            <w:hyperlink w:history="1" r:id="rIdpg4r2lmwjyfvevifzhatu">
+            <w:hyperlink w:history="1" r:id="rId2rhbtxqnifem0geb0q9h8">
               <w:r>
                 <w:rPr>
                   <w:rFonts w:ascii="Aptos Narrow" w:cs="Aptos Narrow" w:eastAsia="Aptos Narrow" w:hAnsi="Aptos Narrow"/>
@@ -1274,7 +1274,7 @@
               </w:rPr>
               <w:t xml:space="preserve">. Key vocabulary: </w:t>
             </w:r>
-            <w:hyperlink w:history="1" r:id="rIdknvhzxboqww5azbucmiyj">
+            <w:hyperlink w:history="1" r:id="rIdhsqzrkxcuav-0empdcofs">
               <w:r>
                 <w:rPr>
                   <w:rFonts w:ascii="Aptos Narrow" w:cs="Aptos Narrow" w:eastAsia="Aptos Narrow" w:hAnsi="Aptos Narrow"/>
@@ -1283,7 +1283,7 @@
                   <w:szCs w:val="20"/>
                   <w:u w:val="single"/>
                 </w:rPr>
-                <w:t xml:space="preserve">Vocab trainer</w:t>
+                <w:t xml:space="preserve">My glossary</w:t>
               </w:r>
             </w:hyperlink>
           </w:p>
@@ -1409,7 +1409,7 @@
               </w:rPr>
               <w:t xml:space="preserve"> · </w:t>
             </w:r>
-            <w:hyperlink w:history="1" r:id="rId_ke6fyg_e3m7g7ektsqbb">
+            <w:hyperlink w:history="1" r:id="rIdpvdmpeexjheeqyszaicww">
               <w:r>
                 <w:rPr>
                   <w:rFonts w:ascii="Aptos Narrow" w:cs="Aptos Narrow" w:eastAsia="Aptos Narrow" w:hAnsi="Aptos Narrow"/>
@@ -1430,7 +1430,7 @@
               </w:rPr>
               <w:t xml:space="preserve"> · </w:t>
             </w:r>
-            <w:hyperlink w:history="1" r:id="rIdyaz2ddopqsq4uf88sgyzg">
+            <w:hyperlink w:history="1" r:id="rIdimpni6ere7mo-hh7vhmlw">
               <w:r>
                 <w:rPr>
                   <w:rFonts w:ascii="Aptos Narrow" w:cs="Aptos Narrow" w:eastAsia="Aptos Narrow" w:hAnsi="Aptos Narrow"/>
@@ -1451,7 +1451,7 @@
               </w:rPr>
               <w:t xml:space="preserve"> · </w:t>
             </w:r>
-            <w:hyperlink w:history="1" r:id="rIdfj0sch_bvd28cacgujwuf">
+            <w:hyperlink w:history="1" r:id="rId25vtetwextqcfuikrbt8e">
               <w:r>
                 <w:rPr>
                   <w:rFonts w:ascii="Aptos Narrow" w:cs="Aptos Narrow" w:eastAsia="Aptos Narrow" w:hAnsi="Aptos Narrow"/>
@@ -1671,7 +1671,7 @@
               </w:rPr>
               <w:t xml:space="preserve"> · </w:t>
             </w:r>
-            <w:hyperlink w:history="1" r:id="rIdgxgj6tzlz_mqu5dpkd5r0">
+            <w:hyperlink w:history="1" r:id="rId0trhu9btzv6igci5xruhr">
               <w:r>
                 <w:rPr>
                   <w:rFonts w:ascii="Aptos Narrow" w:cs="Aptos Narrow" w:eastAsia="Aptos Narrow" w:hAnsi="Aptos Narrow"/>
@@ -1692,7 +1692,7 @@
               </w:rPr>
               <w:t xml:space="preserve"> · </w:t>
             </w:r>
-            <w:hyperlink w:history="1" r:id="rIdgwpuivn_zokqkmmmmikaw">
+            <w:hyperlink w:history="1" r:id="rIdathenbkduf_8lujmzwl_y">
               <w:r>
                 <w:rPr>
                   <w:rFonts w:ascii="Aptos Narrow" w:cs="Aptos Narrow" w:eastAsia="Aptos Narrow" w:hAnsi="Aptos Narrow"/>
@@ -1713,7 +1713,7 @@
               </w:rPr>
               <w:t xml:space="preserve"> · </w:t>
             </w:r>
-            <w:hyperlink w:history="1" r:id="rIdjxiyxwe2cdvi2-u9h_l0u">
+            <w:hyperlink w:history="1" r:id="rIdkaghc3bs_xitrrggx-kig">
               <w:r>
                 <w:rPr>
                   <w:rFonts w:ascii="Aptos Narrow" w:cs="Aptos Narrow" w:eastAsia="Aptos Narrow" w:hAnsi="Aptos Narrow"/>
@@ -1848,7 +1848,7 @@
               </w:rPr>
               <w:t xml:space="preserve"> · </w:t>
             </w:r>
-            <w:hyperlink w:history="1" r:id="rIdq9fijuzpwkbbmd2vtlzrd">
+            <w:hyperlink w:history="1" r:id="rIdpnek03gwieseixvzxbtx2">
               <w:r>
                 <w:rPr>
                   <w:rFonts w:ascii="Aptos Narrow" w:cs="Aptos Narrow" w:eastAsia="Aptos Narrow" w:hAnsi="Aptos Narrow"/>
@@ -1869,7 +1869,7 @@
               </w:rPr>
               <w:t xml:space="preserve"> · </w:t>
             </w:r>
-            <w:hyperlink w:history="1" r:id="rIdfmmuvfmx_--6m6_yof66h">
+            <w:hyperlink w:history="1" r:id="rIdbehkqqzmip5pxsrih__eb">
               <w:r>
                 <w:rPr>
                   <w:rFonts w:ascii="Aptos Narrow" w:cs="Aptos Narrow" w:eastAsia="Aptos Narrow" w:hAnsi="Aptos Narrow"/>
@@ -2004,7 +2004,7 @@
               </w:rPr>
               <w:t xml:space="preserve"> · </w:t>
             </w:r>
-            <w:hyperlink w:history="1" r:id="rIdo87lzoaddyo4fylphvdef">
+            <w:hyperlink w:history="1" r:id="rIdzi_p5ydjffmjcxdvjmetv">
               <w:r>
                 <w:rPr>
                   <w:rFonts w:ascii="Aptos Narrow" w:cs="Aptos Narrow" w:eastAsia="Aptos Narrow" w:hAnsi="Aptos Narrow"/>
@@ -2025,7 +2025,7 @@
               </w:rPr>
               <w:t xml:space="preserve"> · </w:t>
             </w:r>
-            <w:hyperlink w:history="1" r:id="rIdwz9xvui1cglgwsurjbmse">
+            <w:hyperlink w:history="1" r:id="rIdltkzewjww5wc3qvggttom">
               <w:r>
                 <w:rPr>
                   <w:rFonts w:ascii="Aptos Narrow" w:cs="Aptos Narrow" w:eastAsia="Aptos Narrow" w:hAnsi="Aptos Narrow"/>
@@ -2046,7 +2046,7 @@
               </w:rPr>
               <w:t xml:space="preserve"> · </w:t>
             </w:r>
-            <w:hyperlink w:history="1" r:id="rIdebqptoj9wzsaghzea8tg0">
+            <w:hyperlink w:history="1" r:id="rIddlbifiobq6wlz3td2tlie">
               <w:r>
                 <w:rPr>
                   <w:rFonts w:ascii="Aptos Narrow" w:cs="Aptos Narrow" w:eastAsia="Aptos Narrow" w:hAnsi="Aptos Narrow"/>
@@ -2072,7 +2072,7 @@
               </w:rPr>
               <w:t xml:space="preserve">Folio collected and scored: </w:t>
             </w:r>
-            <w:hyperlink w:history="1" r:id="rIdpk6plbwnto6ftofuduiuk">
+            <w:hyperlink w:history="1" r:id="rIdrftyyo5teek_-3ghzl8_w">
               <w:r>
                 <w:rPr>
                   <w:rFonts w:ascii="Aptos Narrow" w:cs="Aptos Narrow" w:eastAsia="Aptos Narrow" w:hAnsi="Aptos Narrow"/>
@@ -2103,7 +2103,7 @@
         </w:rPr>
         <w:t xml:space="preserve">Everything in one place: </w:t>
       </w:r>
-      <w:hyperlink w:history="1" r:id="rIdakhklibkpqmdtsdymlhss">
+      <w:hyperlink w:history="1" r:id="rIdfs-lhrhwg95bzjhnv4pn1">
         <w:r>
           <w:rPr>
             <w:rFonts w:ascii="Aptos Narrow" w:cs="Aptos Narrow" w:eastAsia="Aptos Narrow" w:hAnsi="Aptos Narrow"/>
@@ -2124,7 +2124,7 @@
         </w:rPr>
         <w:t xml:space="preserve"> · </w:t>
       </w:r>
-      <w:hyperlink w:history="1" r:id="rIdbzztercihkg8nylbaipzh">
+      <w:hyperlink w:history="1" r:id="rIdznece91uvb6tyj0ptaegq">
         <w:r>
           <w:rPr>
             <w:rFonts w:ascii="Aptos Narrow" w:cs="Aptos Narrow" w:eastAsia="Aptos Narrow" w:hAnsi="Aptos Narrow"/>
@@ -2145,7 +2145,7 @@
         </w:rPr>
         <w:t xml:space="preserve"> · </w:t>
       </w:r>
-      <w:hyperlink w:history="1" r:id="rIdmknasqyrfuf7_pvy_8dp-">
+      <w:hyperlink w:history="1" r:id="rIdy84o7wq1iksilqm24xnkm">
         <w:r>
           <w:rPr>
             <w:rFonts w:ascii="Aptos Narrow" w:cs="Aptos Narrow" w:eastAsia="Aptos Narrow" w:hAnsi="Aptos Narrow"/>

</xml_diff>

<commit_message>
Files: unit planner refreshed
Co-Authored-By: Claude Fable 5.1 <noreply@anthropic.com>
Claude-Session: https://claude.ai/code/session_019gyiige9BuJUj3e3kcjvaS
</commit_message>
<xml_diff>
--- a/curious-incident/files/Curious Incident - Unit Planner.docx
+++ b/curious-incident/files/Curious Incident - Unit Planner.docx
@@ -283,7 +283,7 @@
               </w:rPr>
               <w:t xml:space="preserve">use interaction skills to discuss opinions regarding texts that have different purposes and audiences, analysing how language features position an audience to respond in particular ways </w:t>
             </w:r>
-            <w:hyperlink w:history="1" r:id="rIdakhhkyubrdvbff6ny8fex">
+            <w:hyperlink w:history="1" r:id="rIdrvpqgai5fmrhdoint0u5t">
               <w:r>
                 <w:rPr>
                   <w:rFonts w:ascii="Aptos Narrow" w:cs="Aptos Narrow" w:eastAsia="Aptos Narrow" w:hAnsi="Aptos Narrow"/>
@@ -314,7 +314,7 @@
               </w:rPr>
               <w:t xml:space="preserve">deliver structured spoken texts for particular purposes, demonstrating different levels of formality in consideration of audience, using features of voice and multimodal or digital elements </w:t>
             </w:r>
-            <w:hyperlink w:history="1" r:id="rIdy4xxhl_wbi3aimkka2wau">
+            <w:hyperlink w:history="1" r:id="rId-d9kgkathxou3k1ppqtdc">
               <w:r>
                 <w:rPr>
                   <w:rFonts w:ascii="Aptos Narrow" w:cs="Aptos Narrow" w:eastAsia="Aptos Narrow" w:hAnsi="Aptos Narrow"/>
@@ -393,7 +393,7 @@
                 <w:sz w:val="20"/>
                 <w:szCs w:val="20"/>
               </w:rPr>
-              <w:t xml:space="preserve">Personal and Social Capability:</w:t>
+              <w:t xml:space="preserve">Personal and Social Capability</w:t>
             </w:r>
           </w:p>
           <w:p>
@@ -412,7 +412,7 @@
                 <w:sz w:val="20"/>
                 <w:szCs w:val="20"/>
               </w:rPr>
-              <w:t xml:space="preserve">Social awareness and management: collaborating in a group, contributing and building on the ideas of others</w:t>
+              <w:t xml:space="preserve">Social awareness and management: Collaboration skills</w:t>
             </w:r>
           </w:p>
           <w:p>
@@ -431,9 +431,133 @@
                 <w:sz w:val="20"/>
                 <w:szCs w:val="20"/>
               </w:rPr>
-              <w:t xml:space="preserve">Social awareness and management: negotiating and resolving disagreement respectfully, conceding a point and keeping a position</w:t>
-            </w:r>
-          </w:p>
+              <w:t xml:space="preserve">Social awareness and management: Conflict</w:t>
+            </w:r>
+          </w:p>
+        </w:tc>
+      </w:tr>
+      <w:tr>
+        <w:tc>
+          <w:tcPr>
+            <w:tcW w:type="dxa" w:w="4106"/>
+            <w:tcBorders>
+              <w:top w:val="single" w:color="808080" w:sz="4"/>
+              <w:left w:val="single" w:color="808080" w:sz="4"/>
+              <w:bottom w:val="single" w:color="808080" w:sz="4"/>
+              <w:right w:val="single" w:color="808080" w:sz="4"/>
+            </w:tcBorders>
+            <w:shd w:fill="70243C" w:color="auto" w:val="clear"/>
+            <w:tcMar>
+              <w:top w:type="dxa" w:w="50"/>
+              <w:left w:type="dxa" w:w="90"/>
+              <w:bottom w:type="dxa" w:w="50"/>
+              <w:right w:type="dxa" w:w="90"/>
+            </w:tcMar>
+            <w:vAlign w:val="center"/>
+          </w:tcPr>
+          <w:p>
+            <w:pPr>
+              <w:spacing w:after="0" w:before="0"/>
+            </w:pPr>
+            <w:r>
+              <w:rPr>
+                <w:rFonts w:ascii="Aptos Narrow" w:cs="Aptos Narrow" w:eastAsia="Aptos Narrow" w:hAnsi="Aptos Narrow"/>
+                <w:b/>
+                <w:bCs/>
+                <w:color w:val="FFFFFF"/>
+                <w:sz w:val="20"/>
+                <w:szCs w:val="20"/>
+              </w:rPr>
+              <w:t xml:space="preserve">Duration</w:t>
+            </w:r>
+          </w:p>
+        </w:tc>
+        <w:tc>
+          <w:tcPr>
+            <w:tcW w:type="dxa" w:w="11292"/>
+            <w:tcBorders>
+              <w:top w:val="single" w:color="808080" w:sz="4"/>
+              <w:left w:val="single" w:color="808080" w:sz="4"/>
+              <w:bottom w:val="single" w:color="808080" w:sz="4"/>
+              <w:right w:val="single" w:color="808080" w:sz="4"/>
+            </w:tcBorders>
+            <w:tcMar>
+              <w:top w:type="dxa" w:w="50"/>
+              <w:left w:type="dxa" w:w="90"/>
+              <w:bottom w:type="dxa" w:w="50"/>
+              <w:right w:type="dxa" w:w="90"/>
+            </w:tcMar>
+            <w:vAlign w:val="center"/>
+          </w:tcPr>
+          <w:p>
+            <w:pPr>
+              <w:spacing w:after="40" w:before="0"/>
+            </w:pPr>
+            <w:r>
+              <w:rPr>
+                <w:rFonts w:ascii="Aptos Narrow" w:cs="Aptos Narrow" w:eastAsia="Aptos Narrow" w:hAnsi="Aptos Narrow"/>
+                <w:color w:val="1F1F1F"/>
+                <w:sz w:val="20"/>
+                <w:szCs w:val="20"/>
+              </w:rPr>
+              <w:t xml:space="preserve">6 weeks, alongside the reading. Three one-period sessions (weeks 2, 4 and 6) plus a set-up lesson.</w:t>
+            </w:r>
+          </w:p>
+        </w:tc>
+      </w:tr>
+      <w:tr>
+        <w:tc>
+          <w:tcPr>
+            <w:tcW w:type="dxa" w:w="4106"/>
+            <w:tcBorders>
+              <w:top w:val="single" w:color="808080" w:sz="4"/>
+              <w:left w:val="single" w:color="808080" w:sz="4"/>
+              <w:bottom w:val="single" w:color="808080" w:sz="4"/>
+              <w:right w:val="single" w:color="808080" w:sz="4"/>
+            </w:tcBorders>
+            <w:shd w:fill="70243C" w:color="auto" w:val="clear"/>
+            <w:tcMar>
+              <w:top w:type="dxa" w:w="50"/>
+              <w:left w:type="dxa" w:w="90"/>
+              <w:bottom w:type="dxa" w:w="50"/>
+              <w:right w:type="dxa" w:w="90"/>
+            </w:tcMar>
+            <w:vAlign w:val="center"/>
+          </w:tcPr>
+          <w:p>
+            <w:pPr>
+              <w:spacing w:after="0" w:before="0"/>
+            </w:pPr>
+            <w:r>
+              <w:rPr>
+                <w:rFonts w:ascii="Aptos Narrow" w:cs="Aptos Narrow" w:eastAsia="Aptos Narrow" w:hAnsi="Aptos Narrow"/>
+                <w:b/>
+                <w:bCs/>
+                <w:color w:val="FFFFFF"/>
+                <w:sz w:val="20"/>
+                <w:szCs w:val="20"/>
+              </w:rPr>
+              <w:t xml:space="preserve">New key vocabulary</w:t>
+            </w:r>
+          </w:p>
+        </w:tc>
+        <w:tc>
+          <w:tcPr>
+            <w:tcW w:type="dxa" w:w="11292"/>
+            <w:tcBorders>
+              <w:top w:val="single" w:color="808080" w:sz="4"/>
+              <w:left w:val="single" w:color="808080" w:sz="4"/>
+              <w:bottom w:val="single" w:color="808080" w:sz="4"/>
+              <w:right w:val="single" w:color="808080" w:sz="4"/>
+            </w:tcBorders>
+            <w:tcMar>
+              <w:top w:type="dxa" w:w="50"/>
+              <w:left w:type="dxa" w:w="90"/>
+              <w:bottom w:type="dxa" w:w="50"/>
+              <w:right w:type="dxa" w:w="90"/>
+            </w:tcMar>
+            <w:vAlign w:val="center"/>
+          </w:tcPr>
           <w:p>
             <w:pPr>
               <w:pStyle w:val="ListParagraph"/>
@@ -450,133 +574,9 @@
                 <w:sz w:val="20"/>
                 <w:szCs w:val="20"/>
               </w:rPr>
-              <w:t xml:space="preserve">Self-awareness and management: taking a turn, giving a turn, and speaking to a class</w:t>
-            </w:r>
-          </w:p>
-        </w:tc>
-      </w:tr>
-      <w:tr>
-        <w:tc>
-          <w:tcPr>
-            <w:tcW w:type="dxa" w:w="4106"/>
-            <w:tcBorders>
-              <w:top w:val="single" w:color="808080" w:sz="4"/>
-              <w:left w:val="single" w:color="808080" w:sz="4"/>
-              <w:bottom w:val="single" w:color="808080" w:sz="4"/>
-              <w:right w:val="single" w:color="808080" w:sz="4"/>
-            </w:tcBorders>
-            <w:shd w:fill="70243C" w:color="auto" w:val="clear"/>
-            <w:tcMar>
-              <w:top w:type="dxa" w:w="50"/>
-              <w:left w:type="dxa" w:w="90"/>
-              <w:bottom w:type="dxa" w:w="50"/>
-              <w:right w:type="dxa" w:w="90"/>
-            </w:tcMar>
-            <w:vAlign w:val="center"/>
-          </w:tcPr>
-          <w:p>
-            <w:pPr>
-              <w:spacing w:after="0" w:before="0"/>
-            </w:pPr>
-            <w:r>
-              <w:rPr>
-                <w:rFonts w:ascii="Aptos Narrow" w:cs="Aptos Narrow" w:eastAsia="Aptos Narrow" w:hAnsi="Aptos Narrow"/>
-                <w:b/>
-                <w:bCs/>
-                <w:color w:val="FFFFFF"/>
-                <w:sz w:val="20"/>
-                <w:szCs w:val="20"/>
-              </w:rPr>
-              <w:t xml:space="preserve">Duration</w:t>
-            </w:r>
-          </w:p>
-        </w:tc>
-        <w:tc>
-          <w:tcPr>
-            <w:tcW w:type="dxa" w:w="11292"/>
-            <w:tcBorders>
-              <w:top w:val="single" w:color="808080" w:sz="4"/>
-              <w:left w:val="single" w:color="808080" w:sz="4"/>
-              <w:bottom w:val="single" w:color="808080" w:sz="4"/>
-              <w:right w:val="single" w:color="808080" w:sz="4"/>
-            </w:tcBorders>
-            <w:tcMar>
-              <w:top w:type="dxa" w:w="50"/>
-              <w:left w:type="dxa" w:w="90"/>
-              <w:bottom w:type="dxa" w:w="50"/>
-              <w:right w:type="dxa" w:w="90"/>
-            </w:tcMar>
-            <w:vAlign w:val="center"/>
-          </w:tcPr>
-          <w:p>
-            <w:pPr>
-              <w:spacing w:after="40" w:before="0"/>
-            </w:pPr>
-            <w:r>
-              <w:rPr>
-                <w:rFonts w:ascii="Aptos Narrow" w:cs="Aptos Narrow" w:eastAsia="Aptos Narrow" w:hAnsi="Aptos Narrow"/>
-                <w:color w:val="1F1F1F"/>
-                <w:sz w:val="20"/>
-                <w:szCs w:val="20"/>
-              </w:rPr>
-              <w:t xml:space="preserve">6 weeks, alongside the reading. Three one-period sessions (weeks 2, 4 and 6) plus a set-up lesson.</w:t>
-            </w:r>
-          </w:p>
-        </w:tc>
-      </w:tr>
-      <w:tr>
-        <w:tc>
-          <w:tcPr>
-            <w:tcW w:type="dxa" w:w="4106"/>
-            <w:tcBorders>
-              <w:top w:val="single" w:color="808080" w:sz="4"/>
-              <w:left w:val="single" w:color="808080" w:sz="4"/>
-              <w:bottom w:val="single" w:color="808080" w:sz="4"/>
-              <w:right w:val="single" w:color="808080" w:sz="4"/>
-            </w:tcBorders>
-            <w:shd w:fill="70243C" w:color="auto" w:val="clear"/>
-            <w:tcMar>
-              <w:top w:type="dxa" w:w="50"/>
-              <w:left w:type="dxa" w:w="90"/>
-              <w:bottom w:type="dxa" w:w="50"/>
-              <w:right w:type="dxa" w:w="90"/>
-            </w:tcMar>
-            <w:vAlign w:val="center"/>
-          </w:tcPr>
-          <w:p>
-            <w:pPr>
-              <w:spacing w:after="0" w:before="0"/>
-            </w:pPr>
-            <w:r>
-              <w:rPr>
-                <w:rFonts w:ascii="Aptos Narrow" w:cs="Aptos Narrow" w:eastAsia="Aptos Narrow" w:hAnsi="Aptos Narrow"/>
-                <w:b/>
-                <w:bCs/>
-                <w:color w:val="FFFFFF"/>
-                <w:sz w:val="20"/>
-                <w:szCs w:val="20"/>
-              </w:rPr>
-              <w:t xml:space="preserve">New key vocabulary</w:t>
-            </w:r>
-          </w:p>
-        </w:tc>
-        <w:tc>
-          <w:tcPr>
-            <w:tcW w:type="dxa" w:w="11292"/>
-            <w:tcBorders>
-              <w:top w:val="single" w:color="808080" w:sz="4"/>
-              <w:left w:val="single" w:color="808080" w:sz="4"/>
-              <w:bottom w:val="single" w:color="808080" w:sz="4"/>
-              <w:right w:val="single" w:color="808080" w:sz="4"/>
-            </w:tcBorders>
-            <w:tcMar>
-              <w:top w:type="dxa" w:w="50"/>
-              <w:left w:type="dxa" w:w="90"/>
-              <w:bottom w:type="dxa" w:w="50"/>
-              <w:right w:type="dxa" w:w="90"/>
-            </w:tcMar>
-            <w:vAlign w:val="center"/>
-          </w:tcPr>
+              <w:t xml:space="preserve">personal response</w:t>
+            </w:r>
+          </w:p>
           <w:p>
             <w:pPr>
               <w:pStyle w:val="ListParagraph"/>
@@ -593,7 +593,7 @@
                 <w:sz w:val="20"/>
                 <w:szCs w:val="20"/>
               </w:rPr>
-              <w:t xml:space="preserve">personal response</w:t>
+              <w:t xml:space="preserve">justify</w:t>
             </w:r>
           </w:p>
           <w:p>
@@ -612,7 +612,7 @@
                 <w:sz w:val="20"/>
                 <w:szCs w:val="20"/>
               </w:rPr>
-              <w:t xml:space="preserve">justify</w:t>
+              <w:t xml:space="preserve">evidence</w:t>
             </w:r>
           </w:p>
           <w:p>
@@ -631,7 +631,7 @@
                 <w:sz w:val="20"/>
                 <w:szCs w:val="20"/>
               </w:rPr>
-              <w:t xml:space="preserve">evidence</w:t>
+              <w:t xml:space="preserve">paraphrase</w:t>
             </w:r>
           </w:p>
           <w:p>
@@ -650,7 +650,7 @@
                 <w:sz w:val="20"/>
                 <w:szCs w:val="20"/>
               </w:rPr>
-              <w:t xml:space="preserve">paraphrase</w:t>
+              <w:t xml:space="preserve">infer, imply</w:t>
             </w:r>
           </w:p>
           <w:p>
@@ -669,7 +669,7 @@
                 <w:sz w:val="20"/>
                 <w:szCs w:val="20"/>
               </w:rPr>
-              <w:t xml:space="preserve">infer, imply</w:t>
+              <w:t xml:space="preserve">reframe</w:t>
             </w:r>
           </w:p>
           <w:p>
@@ -688,7 +688,7 @@
                 <w:sz w:val="20"/>
                 <w:szCs w:val="20"/>
               </w:rPr>
-              <w:t xml:space="preserve">reframe</w:t>
+              <w:t xml:space="preserve">concede</w:t>
             </w:r>
           </w:p>
           <w:p>
@@ -707,7 +707,7 @@
                 <w:sz w:val="20"/>
                 <w:szCs w:val="20"/>
               </w:rPr>
-              <w:t xml:space="preserve">concede</w:t>
+              <w:t xml:space="preserve">elaborate</w:t>
             </w:r>
           </w:p>
           <w:p>
@@ -726,7 +726,7 @@
                 <w:sz w:val="20"/>
                 <w:szCs w:val="20"/>
               </w:rPr>
-              <w:t xml:space="preserve">elaborate</w:t>
+              <w:t xml:space="preserve">turn-taking</w:t>
             </w:r>
           </w:p>
           <w:p>
@@ -745,25 +745,6 @@
                 <w:sz w:val="20"/>
                 <w:szCs w:val="20"/>
               </w:rPr>
-              <w:t xml:space="preserve">turn-taking</w:t>
-            </w:r>
-          </w:p>
-          <w:p>
-            <w:pPr>
-              <w:pStyle w:val="ListParagraph"/>
-              <w:numPr>
-                <w:ilvl w:val="0"/>
-                <w:numId w:val="2"/>
-              </w:numPr>
-              <w:spacing w:after="20"/>
-            </w:pPr>
-            <w:r>
-              <w:rPr>
-                <w:rFonts w:ascii="Aptos Narrow" w:cs="Aptos Narrow" w:eastAsia="Aptos Narrow" w:hAnsi="Aptos Narrow"/>
-                <w:color w:val="1F1F1F"/>
-                <w:sz w:val="20"/>
-                <w:szCs w:val="20"/>
-              </w:rPr>
               <w:t xml:space="preserve">register</w:t>
             </w:r>
           </w:p>
@@ -846,7 +827,7 @@
               </w:rPr>
               <w:t xml:space="preserve">Session 1 · Personal response (</w:t>
             </w:r>
-            <w:hyperlink w:history="1" r:id="rIdpobcilxlvlxk57a_sr1th">
+            <w:hyperlink w:history="1" r:id="rIdftpa0b4qvhcqsflfv0mrr">
               <w:r>
                 <w:rPr>
                   <w:rFonts w:ascii="Aptos Narrow" w:cs="Aptos Narrow" w:eastAsia="Aptos Narrow" w:hAnsi="Aptos Narrow"/>
@@ -892,7 +873,7 @@
               </w:rPr>
               <w:t xml:space="preserve">Session 2 · I couldn't disagree more (</w:t>
             </w:r>
-            <w:hyperlink w:history="1" r:id="rId09n38qbisltj8snra14vt">
+            <w:hyperlink w:history="1" r:id="rIdov7z9ixtdouqshf59kxno">
               <w:r>
                 <w:rPr>
                   <w:rFonts w:ascii="Aptos Narrow" w:cs="Aptos Narrow" w:eastAsia="Aptos Narrow" w:hAnsi="Aptos Narrow"/>
@@ -938,7 +919,7 @@
               </w:rPr>
               <w:t xml:space="preserve">Session 3 · Passage analysis panel (</w:t>
             </w:r>
-            <w:hyperlink w:history="1" r:id="rId238aujzrt9puwywjqobuj">
+            <w:hyperlink w:history="1" r:id="rIdx28utfvxf4tkvup8lxfub">
               <w:r>
                 <w:rPr>
                   <w:rFonts w:ascii="Aptos Narrow" w:cs="Aptos Narrow" w:eastAsia="Aptos Narrow" w:hAnsi="Aptos Narrow"/>
@@ -959,7 +940,7 @@
               </w:rPr>
               <w:t xml:space="preserve">) and the completed Speaking and Listening Folio: Table 1 record on the front page, three strands, against the continuum (</w:t>
             </w:r>
-            <w:hyperlink w:history="1" r:id="rIdjvfw4dlk7wbisvvqh6bbh">
+            <w:hyperlink w:history="1" r:id="rIdok6xwlduigne49xdq791e">
               <w:r>
                 <w:rPr>
                   <w:rFonts w:ascii="Aptos Narrow" w:cs="Aptos Narrow" w:eastAsia="Aptos Narrow" w:hAnsi="Aptos Narrow"/>
@@ -980,7 +961,7 @@
               </w:rPr>
               <w:t xml:space="preserve"> · </w:t>
             </w:r>
-            <w:hyperlink w:history="1" r:id="rIdjtl3dllzzkyuf_gx4vi3v">
+            <w:hyperlink w:history="1" r:id="rId95urexeptkcti1g4jjdlp">
               <w:r>
                 <w:rPr>
                   <w:rFonts w:ascii="Aptos Narrow" w:cs="Aptos Narrow" w:eastAsia="Aptos Narrow" w:hAnsi="Aptos Narrow"/>
@@ -1232,7 +1213,7 @@
               </w:rPr>
               <w:t xml:space="preserve">Groups made on the </w:t>
             </w:r>
-            <w:hyperlink w:history="1" r:id="rIdwxa_kv47tdrxzg36uocnq">
+            <w:hyperlink w:history="1" r:id="rId3d-6k3ybnbptqybbueyxf">
               <w:r>
                 <w:rPr>
                   <w:rFonts w:ascii="Aptos Narrow" w:cs="Aptos Narrow" w:eastAsia="Aptos Narrow" w:hAnsi="Aptos Narrow"/>
@@ -1253,7 +1234,7 @@
               </w:rPr>
               <w:t xml:space="preserve">. Folio handed out: </w:t>
             </w:r>
-            <w:hyperlink w:history="1" r:id="rId2rhbtxqnifem0geb0q9h8">
+            <w:hyperlink w:history="1" r:id="rIduzjuakcncjnulj0fsmloz">
               <w:r>
                 <w:rPr>
                   <w:rFonts w:ascii="Aptos Narrow" w:cs="Aptos Narrow" w:eastAsia="Aptos Narrow" w:hAnsi="Aptos Narrow"/>
@@ -1274,7 +1255,7 @@
               </w:rPr>
               <w:t xml:space="preserve">. Key vocabulary: </w:t>
             </w:r>
-            <w:hyperlink w:history="1" r:id="rIdhsqzrkxcuav-0empdcofs">
+            <w:hyperlink w:history="1" r:id="rIdifhfrjmcq3a9ulqjy83h-">
               <w:r>
                 <w:rPr>
                   <w:rFonts w:ascii="Aptos Narrow" w:cs="Aptos Narrow" w:eastAsia="Aptos Narrow" w:hAnsi="Aptos Narrow"/>
@@ -1409,7 +1390,7 @@
               </w:rPr>
               <w:t xml:space="preserve"> · </w:t>
             </w:r>
-            <w:hyperlink w:history="1" r:id="rIdpvdmpeexjheeqyszaicww">
+            <w:hyperlink w:history="1" r:id="rIdlfzxcv1vlee3gzqtxlpfl">
               <w:r>
                 <w:rPr>
                   <w:rFonts w:ascii="Aptos Narrow" w:cs="Aptos Narrow" w:eastAsia="Aptos Narrow" w:hAnsi="Aptos Narrow"/>
@@ -1430,7 +1411,7 @@
               </w:rPr>
               <w:t xml:space="preserve"> · </w:t>
             </w:r>
-            <w:hyperlink w:history="1" r:id="rIdimpni6ere7mo-hh7vhmlw">
+            <w:hyperlink w:history="1" r:id="rIdsfvvbbp15-mah0zaxyaof">
               <w:r>
                 <w:rPr>
                   <w:rFonts w:ascii="Aptos Narrow" w:cs="Aptos Narrow" w:eastAsia="Aptos Narrow" w:hAnsi="Aptos Narrow"/>
@@ -1451,7 +1432,7 @@
               </w:rPr>
               <w:t xml:space="preserve"> · </w:t>
             </w:r>
-            <w:hyperlink w:history="1" r:id="rId25vtetwextqcfuikrbt8e">
+            <w:hyperlink w:history="1" r:id="rIdb-flnl-eddrtmjyvnkb9g">
               <w:r>
                 <w:rPr>
                   <w:rFonts w:ascii="Aptos Narrow" w:cs="Aptos Narrow" w:eastAsia="Aptos Narrow" w:hAnsi="Aptos Narrow"/>
@@ -1671,7 +1652,7 @@
               </w:rPr>
               <w:t xml:space="preserve"> · </w:t>
             </w:r>
-            <w:hyperlink w:history="1" r:id="rId0trhu9btzv6igci5xruhr">
+            <w:hyperlink w:history="1" r:id="rIdqfn7itp9fyj8s0g2u5lkt">
               <w:r>
                 <w:rPr>
                   <w:rFonts w:ascii="Aptos Narrow" w:cs="Aptos Narrow" w:eastAsia="Aptos Narrow" w:hAnsi="Aptos Narrow"/>
@@ -1692,7 +1673,7 @@
               </w:rPr>
               <w:t xml:space="preserve"> · </w:t>
             </w:r>
-            <w:hyperlink w:history="1" r:id="rIdathenbkduf_8lujmzwl_y">
+            <w:hyperlink w:history="1" r:id="rIdaiqc1uiye4bqymnt5uvfj">
               <w:r>
                 <w:rPr>
                   <w:rFonts w:ascii="Aptos Narrow" w:cs="Aptos Narrow" w:eastAsia="Aptos Narrow" w:hAnsi="Aptos Narrow"/>
@@ -1713,7 +1694,7 @@
               </w:rPr>
               <w:t xml:space="preserve"> · </w:t>
             </w:r>
-            <w:hyperlink w:history="1" r:id="rIdkaghc3bs_xitrrggx-kig">
+            <w:hyperlink w:history="1" r:id="rIdvjiuh06tipcewxvyjmeyx">
               <w:r>
                 <w:rPr>
                   <w:rFonts w:ascii="Aptos Narrow" w:cs="Aptos Narrow" w:eastAsia="Aptos Narrow" w:hAnsi="Aptos Narrow"/>
@@ -1848,7 +1829,7 @@
               </w:rPr>
               <w:t xml:space="preserve"> · </w:t>
             </w:r>
-            <w:hyperlink w:history="1" r:id="rIdpnek03gwieseixvzxbtx2">
+            <w:hyperlink w:history="1" r:id="rIduprblu5diqttwi4pg44fu">
               <w:r>
                 <w:rPr>
                   <w:rFonts w:ascii="Aptos Narrow" w:cs="Aptos Narrow" w:eastAsia="Aptos Narrow" w:hAnsi="Aptos Narrow"/>
@@ -1869,7 +1850,7 @@
               </w:rPr>
               <w:t xml:space="preserve"> · </w:t>
             </w:r>
-            <w:hyperlink w:history="1" r:id="rIdbehkqqzmip5pxsrih__eb">
+            <w:hyperlink w:history="1" r:id="rIdmjlzzjfdwaidinpdhgqf-">
               <w:r>
                 <w:rPr>
                   <w:rFonts w:ascii="Aptos Narrow" w:cs="Aptos Narrow" w:eastAsia="Aptos Narrow" w:hAnsi="Aptos Narrow"/>
@@ -2004,7 +1985,7 @@
               </w:rPr>
               <w:t xml:space="preserve"> · </w:t>
             </w:r>
-            <w:hyperlink w:history="1" r:id="rIdzi_p5ydjffmjcxdvjmetv">
+            <w:hyperlink w:history="1" r:id="rIdigwn8srwuwklvxptzumkb">
               <w:r>
                 <w:rPr>
                   <w:rFonts w:ascii="Aptos Narrow" w:cs="Aptos Narrow" w:eastAsia="Aptos Narrow" w:hAnsi="Aptos Narrow"/>
@@ -2025,7 +2006,7 @@
               </w:rPr>
               <w:t xml:space="preserve"> · </w:t>
             </w:r>
-            <w:hyperlink w:history="1" r:id="rIdltkzewjww5wc3qvggttom">
+            <w:hyperlink w:history="1" r:id="rIdgmbeivfcjxiwqmx8z8fik">
               <w:r>
                 <w:rPr>
                   <w:rFonts w:ascii="Aptos Narrow" w:cs="Aptos Narrow" w:eastAsia="Aptos Narrow" w:hAnsi="Aptos Narrow"/>
@@ -2046,7 +2027,7 @@
               </w:rPr>
               <w:t xml:space="preserve"> · </w:t>
             </w:r>
-            <w:hyperlink w:history="1" r:id="rIddlbifiobq6wlz3td2tlie">
+            <w:hyperlink w:history="1" r:id="rIdexorkdm_tj4evozma5_ex">
               <w:r>
                 <w:rPr>
                   <w:rFonts w:ascii="Aptos Narrow" w:cs="Aptos Narrow" w:eastAsia="Aptos Narrow" w:hAnsi="Aptos Narrow"/>
@@ -2072,7 +2053,7 @@
               </w:rPr>
               <w:t xml:space="preserve">Folio collected and scored: </w:t>
             </w:r>
-            <w:hyperlink w:history="1" r:id="rIdrftyyo5teek_-3ghzl8_w">
+            <w:hyperlink w:history="1" r:id="rId_zk2xazzv-ekel1hrcpla">
               <w:r>
                 <w:rPr>
                   <w:rFonts w:ascii="Aptos Narrow" w:cs="Aptos Narrow" w:eastAsia="Aptos Narrow" w:hAnsi="Aptos Narrow"/>
@@ -2103,7 +2084,7 @@
         </w:rPr>
         <w:t xml:space="preserve">Everything in one place: </w:t>
       </w:r>
-      <w:hyperlink w:history="1" r:id="rIdfs-lhrhwg95bzjhnv4pn1">
+      <w:hyperlink w:history="1" r:id="rIdko5-t6n7owetvhv3ggjmb">
         <w:r>
           <w:rPr>
             <w:rFonts w:ascii="Aptos Narrow" w:cs="Aptos Narrow" w:eastAsia="Aptos Narrow" w:hAnsi="Aptos Narrow"/>
@@ -2124,7 +2105,7 @@
         </w:rPr>
         <w:t xml:space="preserve"> · </w:t>
       </w:r>
-      <w:hyperlink w:history="1" r:id="rIdznece91uvb6tyj0ptaegq">
+      <w:hyperlink w:history="1" r:id="rIdrenc8ifvjuxj9jvtvydot">
         <w:r>
           <w:rPr>
             <w:rFonts w:ascii="Aptos Narrow" w:cs="Aptos Narrow" w:eastAsia="Aptos Narrow" w:hAnsi="Aptos Narrow"/>
@@ -2145,7 +2126,7 @@
         </w:rPr>
         <w:t xml:space="preserve"> · </w:t>
       </w:r>
-      <w:hyperlink w:history="1" r:id="rIdy84o7wq1iksilqm24xnkm">
+      <w:hyperlink w:history="1" r:id="rIdc3bfjm-_ykagbndn_sb51">
         <w:r>
           <w:rPr>
             <w:rFonts w:ascii="Aptos Narrow" w:cs="Aptos Narrow" w:eastAsia="Aptos Narrow" w:hAnsi="Aptos Narrow"/>
@@ -3187,38 +3168,510 @@
                 <w:sz w:val="18"/>
                 <w:szCs w:val="18"/>
               </w:rPr>
-              <w:t xml:space="preserve">VC Capabilities</w:t>
-            </w:r>
-          </w:p>
-        </w:tc>
-        <w:tc>
-          <w:tcPr>
-            <w:tcW w:type="dxa" w:w="11544"/>
-            <w:tcBorders>
-              <w:top w:val="single" w:color="808080" w:sz="4"/>
-              <w:left w:val="single" w:color="808080" w:sz="4"/>
-              <w:bottom w:val="single" w:color="808080" w:sz="4"/>
-              <w:right w:val="single" w:color="808080" w:sz="4"/>
-            </w:tcBorders>
-            <w:tcMar>
-              <w:top w:type="dxa" w:w="50"/>
-              <w:left w:type="dxa" w:w="90"/>
-              <w:bottom w:type="dxa" w:w="50"/>
-              <w:right w:type="dxa" w:w="90"/>
-            </w:tcMar>
-            <w:vAlign w:val="top"/>
-          </w:tcPr>
-          <w:p>
-            <w:pPr>
-              <w:spacing w:after="0" w:before="0"/>
-            </w:pPr>
-            <w:r>
-              <w:rPr>
-                <w:rFonts w:ascii="Aptos Narrow" w:cs="Aptos Narrow" w:eastAsia="Aptos Narrow" w:hAnsi="Aptos Narrow"/>
+              <w:t xml:space="preserve">Personal and Social: Collaboration skills</w:t>
+            </w:r>
+          </w:p>
+        </w:tc>
+        <w:tc>
+          <w:tcPr>
+            <w:tcW w:type="dxa" w:w="1924"/>
+            <w:tcBorders>
+              <w:top w:val="single" w:color="808080" w:sz="4"/>
+              <w:left w:val="single" w:color="808080" w:sz="4"/>
+              <w:bottom w:val="single" w:color="808080" w:sz="4"/>
+              <w:right w:val="single" w:color="808080" w:sz="4"/>
+            </w:tcBorders>
+            <w:tcMar>
+              <w:top w:type="dxa" w:w="50"/>
+              <w:left w:type="dxa" w:w="90"/>
+              <w:bottom w:type="dxa" w:w="50"/>
+              <w:right w:type="dxa" w:w="90"/>
+            </w:tcMar>
+            <w:vAlign w:val="top"/>
+          </w:tcPr>
+          <w:p>
+            <w:pPr>
+              <w:spacing w:after="0" w:before="0"/>
+            </w:pPr>
+            <w:r>
+              <w:rPr>
+                <w:rFonts w:ascii="Aptos Narrow" w:cs="Aptos Narrow" w:eastAsia="Aptos Narrow" w:hAnsi="Aptos Narrow"/>
+                <w:i w:val="false"/>
+                <w:iCs w:val="false"/>
                 <w:sz w:val="16"/>
                 <w:szCs w:val="16"/>
               </w:rPr>
-              <w:t xml:space="preserve">Personal and Social Capability: collaboration, building on the ideas of others, respectful disagreement, turn-taking.</w:t>
+              <w:t xml:space="preserve">I can evaluate the performance of a team and my role within it</w:t>
+            </w:r>
+          </w:p>
+        </w:tc>
+        <w:tc>
+          <w:tcPr>
+            <w:tcW w:type="dxa" w:w="1924"/>
+            <w:tcBorders>
+              <w:top w:val="single" w:color="808080" w:sz="4"/>
+              <w:left w:val="single" w:color="808080" w:sz="4"/>
+              <w:bottom w:val="single" w:color="808080" w:sz="4"/>
+              <w:right w:val="single" w:color="808080" w:sz="4"/>
+            </w:tcBorders>
+            <w:tcMar>
+              <w:top w:type="dxa" w:w="50"/>
+              <w:left w:type="dxa" w:w="90"/>
+              <w:bottom w:type="dxa" w:w="50"/>
+              <w:right w:type="dxa" w:w="90"/>
+            </w:tcMar>
+            <w:vAlign w:val="top"/>
+          </w:tcPr>
+          <w:p>
+            <w:pPr>
+              <w:spacing w:after="0" w:before="0"/>
+            </w:pPr>
+            <w:r>
+              <w:rPr>
+                <w:rFonts w:ascii="Aptos Narrow" w:cs="Aptos Narrow" w:eastAsia="Aptos Narrow" w:hAnsi="Aptos Narrow"/>
+                <w:i w:val="false"/>
+                <w:iCs w:val="false"/>
+                <w:sz w:val="16"/>
+                <w:szCs w:val="16"/>
+              </w:rPr>
+              <w:t xml:space="preserve">I can perform different group and leadershp roles within a group activity</w:t>
+            </w:r>
+          </w:p>
+        </w:tc>
+        <w:tc>
+          <w:tcPr>
+            <w:tcW w:type="dxa" w:w="1924"/>
+            <w:tcBorders>
+              <w:top w:val="single" w:color="808080" w:sz="4"/>
+              <w:left w:val="single" w:color="808080" w:sz="4"/>
+              <w:bottom w:val="single" w:color="808080" w:sz="4"/>
+              <w:right w:val="single" w:color="808080" w:sz="4"/>
+            </w:tcBorders>
+            <w:tcMar>
+              <w:top w:type="dxa" w:w="50"/>
+              <w:left w:type="dxa" w:w="90"/>
+              <w:bottom w:type="dxa" w:w="50"/>
+              <w:right w:type="dxa" w:w="90"/>
+            </w:tcMar>
+            <w:vAlign w:val="top"/>
+          </w:tcPr>
+          <w:p>
+            <w:pPr>
+              <w:spacing w:after="0" w:before="0"/>
+            </w:pPr>
+            <w:r>
+              <w:rPr>
+                <w:rFonts w:ascii="Aptos Narrow" w:cs="Aptos Narrow" w:eastAsia="Aptos Narrow" w:hAnsi="Aptos Narrow"/>
+                <w:i w:val="false"/>
+                <w:iCs w:val="false"/>
+                <w:sz w:val="16"/>
+                <w:szCs w:val="16"/>
+              </w:rPr>
+              <w:t xml:space="preserve">I can reflect on my ability to support other members of a team</w:t>
+            </w:r>
+          </w:p>
+        </w:tc>
+        <w:tc>
+          <w:tcPr>
+            <w:tcW w:type="dxa" w:w="1924"/>
+            <w:tcBorders>
+              <w:top w:val="single" w:color="808080" w:sz="4"/>
+              <w:left w:val="single" w:color="808080" w:sz="4"/>
+              <w:bottom w:val="single" w:color="808080" w:sz="4"/>
+              <w:right w:val="single" w:color="808080" w:sz="4"/>
+            </w:tcBorders>
+            <w:shd w:fill="FBF1EA" w:color="auto" w:val="clear"/>
+            <w:tcMar>
+              <w:top w:type="dxa" w:w="50"/>
+              <w:left w:type="dxa" w:w="90"/>
+              <w:bottom w:type="dxa" w:w="50"/>
+              <w:right w:type="dxa" w:w="90"/>
+            </w:tcMar>
+            <w:vAlign w:val="top"/>
+          </w:tcPr>
+          <w:p>
+            <w:pPr>
+              <w:spacing w:after="0" w:before="0"/>
+            </w:pPr>
+            <w:r>
+              <w:rPr>
+                <w:rFonts w:ascii="Aptos Narrow" w:cs="Aptos Narrow" w:eastAsia="Aptos Narrow" w:hAnsi="Aptos Narrow"/>
+                <w:i w:val="false"/>
+                <w:iCs w:val="false"/>
+                <w:sz w:val="16"/>
+                <w:szCs w:val="16"/>
+              </w:rPr>
+              <w:t xml:space="preserve">I can use criteria to evaluate my own and others' contributions to group tasks</w:t>
+            </w:r>
+          </w:p>
+        </w:tc>
+        <w:tc>
+          <w:tcPr>
+            <w:tcW w:type="dxa" w:w="1924"/>
+            <w:tcBorders>
+              <w:top w:val="single" w:color="808080" w:sz="4"/>
+              <w:left w:val="single" w:color="808080" w:sz="4"/>
+              <w:bottom w:val="single" w:color="808080" w:sz="4"/>
+              <w:right w:val="single" w:color="808080" w:sz="4"/>
+            </w:tcBorders>
+            <w:tcMar>
+              <w:top w:type="dxa" w:w="50"/>
+              <w:left w:type="dxa" w:w="90"/>
+              <w:bottom w:type="dxa" w:w="50"/>
+              <w:right w:type="dxa" w:w="90"/>
+            </w:tcMar>
+            <w:vAlign w:val="top"/>
+          </w:tcPr>
+          <w:p>
+            <w:pPr>
+              <w:spacing w:after="0" w:before="0"/>
+            </w:pPr>
+            <w:r>
+              <w:rPr>
+                <w:rFonts w:ascii="Aptos Narrow" w:cs="Aptos Narrow" w:eastAsia="Aptos Narrow" w:hAnsi="Aptos Narrow"/>
+                <w:i w:val="false"/>
+                <w:iCs w:val="false"/>
+                <w:sz w:val="16"/>
+                <w:szCs w:val="16"/>
+              </w:rPr>
+              <w:t xml:space="preserve">I can provide and act upon constructive feedback to help achieve team goals</w:t>
+            </w:r>
+          </w:p>
+        </w:tc>
+        <w:tc>
+          <w:tcPr>
+            <w:tcW w:type="dxa" w:w="1924"/>
+            <w:tcBorders>
+              <w:top w:val="single" w:color="808080" w:sz="4"/>
+              <w:left w:val="single" w:color="808080" w:sz="4"/>
+              <w:bottom w:val="single" w:color="808080" w:sz="4"/>
+              <w:right w:val="single" w:color="808080" w:sz="4"/>
+            </w:tcBorders>
+            <w:tcMar>
+              <w:top w:type="dxa" w:w="50"/>
+              <w:left w:type="dxa" w:w="90"/>
+              <w:bottom w:type="dxa" w:w="50"/>
+              <w:right w:type="dxa" w:w="90"/>
+            </w:tcMar>
+            <w:vAlign w:val="top"/>
+          </w:tcPr>
+          <w:p>
+            <w:pPr>
+              <w:spacing w:after="0" w:before="0"/>
+            </w:pPr>
+            <w:r>
+              <w:rPr>
+                <w:rFonts w:ascii="Aptos Narrow" w:cs="Aptos Narrow" w:eastAsia="Aptos Narrow" w:hAnsi="Aptos Narrow"/>
+                <w:i w:val="false"/>
+                <w:iCs w:val="false"/>
+                <w:sz w:val="16"/>
+                <w:szCs w:val="16"/>
+              </w:rPr>
+              <w:t xml:space="preserve">I can critique the nature and structure of group and leadership roles and make recommendations for future tasks</w:t>
+            </w:r>
+          </w:p>
+        </w:tc>
+      </w:tr>
+      <w:tr>
+        <w:tc>
+          <w:tcPr>
+            <w:tcW w:type="dxa" w:w="3854"/>
+            <w:tcBorders>
+              <w:top w:val="single" w:color="808080" w:sz="4"/>
+              <w:left w:val="single" w:color="808080" w:sz="4"/>
+              <w:bottom w:val="single" w:color="808080" w:sz="4"/>
+              <w:right w:val="single" w:color="808080" w:sz="4"/>
+            </w:tcBorders>
+            <w:shd w:fill="70243C" w:color="auto" w:val="clear"/>
+            <w:tcMar>
+              <w:top w:type="dxa" w:w="50"/>
+              <w:left w:type="dxa" w:w="90"/>
+              <w:bottom w:type="dxa" w:w="50"/>
+              <w:right w:type="dxa" w:w="90"/>
+            </w:tcMar>
+            <w:vAlign w:val="center"/>
+          </w:tcPr>
+          <w:p>
+            <w:pPr>
+              <w:spacing w:after="0" w:before="0"/>
+            </w:pPr>
+            <w:r>
+              <w:rPr>
+                <w:rFonts w:ascii="Aptos Narrow" w:cs="Aptos Narrow" w:eastAsia="Aptos Narrow" w:hAnsi="Aptos Narrow"/>
+                <w:b/>
+                <w:bCs/>
+                <w:color w:val="FFFFFF"/>
+                <w:sz w:val="18"/>
+                <w:szCs w:val="18"/>
+              </w:rPr>
+              <w:t xml:space="preserve">Personal and Social: Conflict</w:t>
+            </w:r>
+          </w:p>
+        </w:tc>
+        <w:tc>
+          <w:tcPr>
+            <w:tcW w:type="dxa" w:w="1924"/>
+            <w:tcBorders>
+              <w:top w:val="single" w:color="808080" w:sz="4"/>
+              <w:left w:val="single" w:color="808080" w:sz="4"/>
+              <w:bottom w:val="single" w:color="808080" w:sz="4"/>
+              <w:right w:val="single" w:color="808080" w:sz="4"/>
+            </w:tcBorders>
+            <w:tcMar>
+              <w:top w:type="dxa" w:w="50"/>
+              <w:left w:type="dxa" w:w="90"/>
+              <w:bottom w:type="dxa" w:w="50"/>
+              <w:right w:type="dxa" w:w="90"/>
+            </w:tcMar>
+            <w:vAlign w:val="top"/>
+          </w:tcPr>
+          <w:p>
+            <w:pPr>
+              <w:spacing w:after="0" w:before="0"/>
+            </w:pPr>
+            <w:r>
+              <w:rPr>
+                <w:rFonts w:ascii="Aptos Narrow" w:cs="Aptos Narrow" w:eastAsia="Aptos Narrow" w:hAnsi="Aptos Narrow"/>
+                <w:i w:val="false"/>
+                <w:iCs w:val="false"/>
+                <w:sz w:val="16"/>
+                <w:szCs w:val="16"/>
+              </w:rPr>
+              <w:t xml:space="preserve">I can describe possible strategies for avoiding conflict</w:t>
+            </w:r>
+          </w:p>
+        </w:tc>
+        <w:tc>
+          <w:tcPr>
+            <w:tcW w:type="dxa" w:w="1924"/>
+            <w:tcBorders>
+              <w:top w:val="single" w:color="808080" w:sz="4"/>
+              <w:left w:val="single" w:color="808080" w:sz="4"/>
+              <w:bottom w:val="single" w:color="808080" w:sz="4"/>
+              <w:right w:val="single" w:color="808080" w:sz="4"/>
+            </w:tcBorders>
+            <w:tcMar>
+              <w:top w:type="dxa" w:w="50"/>
+              <w:left w:type="dxa" w:w="90"/>
+              <w:bottom w:type="dxa" w:w="50"/>
+              <w:right w:type="dxa" w:w="90"/>
+            </w:tcMar>
+            <w:vAlign w:val="top"/>
+          </w:tcPr>
+          <w:p>
+            <w:pPr>
+              <w:spacing w:after="0" w:before="0"/>
+            </w:pPr>
+            <w:r>
+              <w:rPr>
+                <w:rFonts w:ascii="Aptos Narrow" w:cs="Aptos Narrow" w:eastAsia="Aptos Narrow" w:hAnsi="Aptos Narrow"/>
+                <w:i w:val="false"/>
+                <w:iCs w:val="false"/>
+                <w:sz w:val="16"/>
+                <w:szCs w:val="16"/>
+              </w:rPr>
+              <w:t xml:space="preserve">I can describe ways to be proactive to avoid conflict</w:t>
+            </w:r>
+          </w:p>
+        </w:tc>
+        <w:tc>
+          <w:tcPr>
+            <w:tcW w:type="dxa" w:w="1924"/>
+            <w:tcBorders>
+              <w:top w:val="single" w:color="808080" w:sz="4"/>
+              <w:left w:val="single" w:color="808080" w:sz="4"/>
+              <w:bottom w:val="single" w:color="808080" w:sz="4"/>
+              <w:right w:val="single" w:color="808080" w:sz="4"/>
+            </w:tcBorders>
+            <w:tcMar>
+              <w:top w:type="dxa" w:w="50"/>
+              <w:left w:type="dxa" w:w="90"/>
+              <w:bottom w:type="dxa" w:w="50"/>
+              <w:right w:type="dxa" w:w="90"/>
+            </w:tcMar>
+            <w:vAlign w:val="top"/>
+          </w:tcPr>
+          <w:p>
+            <w:pPr>
+              <w:spacing w:after="0" w:before="0"/>
+            </w:pPr>
+            <w:r>
+              <w:rPr>
+                <w:rFonts w:ascii="Aptos Narrow" w:cs="Aptos Narrow" w:eastAsia="Aptos Narrow" w:hAnsi="Aptos Narrow"/>
+                <w:i w:val="false"/>
+                <w:iCs w:val="false"/>
+                <w:sz w:val="16"/>
+                <w:szCs w:val="16"/>
+              </w:rPr>
+              <w:t xml:space="preserve">I can enact proactive strategies for avoiding and resolving conflict</w:t>
+            </w:r>
+          </w:p>
+        </w:tc>
+        <w:tc>
+          <w:tcPr>
+            <w:tcW w:type="dxa" w:w="1924"/>
+            <w:tcBorders>
+              <w:top w:val="single" w:color="808080" w:sz="4"/>
+              <w:left w:val="single" w:color="808080" w:sz="4"/>
+              <w:bottom w:val="single" w:color="808080" w:sz="4"/>
+              <w:right w:val="single" w:color="808080" w:sz="4"/>
+            </w:tcBorders>
+            <w:shd w:fill="FBF1EA" w:color="auto" w:val="clear"/>
+            <w:tcMar>
+              <w:top w:type="dxa" w:w="50"/>
+              <w:left w:type="dxa" w:w="90"/>
+              <w:bottom w:type="dxa" w:w="50"/>
+              <w:right w:type="dxa" w:w="90"/>
+            </w:tcMar>
+            <w:vAlign w:val="top"/>
+          </w:tcPr>
+          <w:p>
+            <w:pPr>
+              <w:spacing w:after="0" w:before="0"/>
+            </w:pPr>
+            <w:r>
+              <w:rPr>
+                <w:rFonts w:ascii="Aptos Narrow" w:cs="Aptos Narrow" w:eastAsia="Aptos Narrow" w:hAnsi="Aptos Narrow"/>
+                <w:i w:val="false"/>
+                <w:iCs w:val="false"/>
+                <w:sz w:val="16"/>
+                <w:szCs w:val="16"/>
+              </w:rPr>
+              <w:t xml:space="preserve">I can describe skills and strategies that help prevent or resolve conflict</w:t>
+            </w:r>
+          </w:p>
+        </w:tc>
+        <w:tc>
+          <w:tcPr>
+            <w:tcW w:type="dxa" w:w="1924"/>
+            <w:tcBorders>
+              <w:top w:val="single" w:color="808080" w:sz="4"/>
+              <w:left w:val="single" w:color="808080" w:sz="4"/>
+              <w:bottom w:val="single" w:color="808080" w:sz="4"/>
+              <w:right w:val="single" w:color="808080" w:sz="4"/>
+            </w:tcBorders>
+            <w:tcMar>
+              <w:top w:type="dxa" w:w="50"/>
+              <w:left w:type="dxa" w:w="90"/>
+              <w:bottom w:type="dxa" w:w="50"/>
+              <w:right w:type="dxa" w:w="90"/>
+            </w:tcMar>
+            <w:vAlign w:val="top"/>
+          </w:tcPr>
+          <w:p>
+            <w:pPr>
+              <w:spacing w:after="0" w:before="0"/>
+            </w:pPr>
+            <w:r>
+              <w:rPr>
+                <w:rFonts w:ascii="Aptos Narrow" w:cs="Aptos Narrow" w:eastAsia="Aptos Narrow" w:hAnsi="Aptos Narrow"/>
+                <w:i w:val="false"/>
+                <w:iCs w:val="false"/>
+                <w:sz w:val="16"/>
+                <w:szCs w:val="16"/>
+              </w:rPr>
+              <w:t xml:space="preserve">I can explain how different skills and strategies help to manage conflict in a range of scenarios</w:t>
+            </w:r>
+          </w:p>
+        </w:tc>
+        <w:tc>
+          <w:tcPr>
+            <w:tcW w:type="dxa" w:w="1924"/>
+            <w:tcBorders>
+              <w:top w:val="single" w:color="808080" w:sz="4"/>
+              <w:left w:val="single" w:color="808080" w:sz="4"/>
+              <w:bottom w:val="single" w:color="808080" w:sz="4"/>
+              <w:right w:val="single" w:color="808080" w:sz="4"/>
+            </w:tcBorders>
+            <w:tcMar>
+              <w:top w:type="dxa" w:w="50"/>
+              <w:left w:type="dxa" w:w="90"/>
+              <w:bottom w:type="dxa" w:w="50"/>
+              <w:right w:type="dxa" w:w="90"/>
+            </w:tcMar>
+            <w:vAlign w:val="top"/>
+          </w:tcPr>
+          <w:p>
+            <w:pPr>
+              <w:spacing w:after="0" w:before="0"/>
+            </w:pPr>
+            <w:r>
+              <w:rPr>
+                <w:rFonts w:ascii="Aptos Narrow" w:cs="Aptos Narrow" w:eastAsia="Aptos Narrow" w:hAnsi="Aptos Narrow"/>
+                <w:i w:val="false"/>
+                <w:iCs w:val="false"/>
+                <w:sz w:val="16"/>
+                <w:szCs w:val="16"/>
+              </w:rPr>
+              <w:t xml:space="preserve">I can draw on my own skills and strategies to manage different types of group conflict</w:t>
+            </w:r>
+          </w:p>
+        </w:tc>
+      </w:tr>
+      <w:tr>
+        <w:tc>
+          <w:tcPr>
+            <w:tcW w:type="dxa" w:w="3854"/>
+            <w:tcBorders>
+              <w:top w:val="single" w:color="808080" w:sz="4"/>
+              <w:left w:val="single" w:color="808080" w:sz="4"/>
+              <w:bottom w:val="single" w:color="808080" w:sz="4"/>
+              <w:right w:val="single" w:color="808080" w:sz="4"/>
+            </w:tcBorders>
+            <w:shd w:fill="70243C" w:color="auto" w:val="clear"/>
+            <w:tcMar>
+              <w:top w:type="dxa" w:w="50"/>
+              <w:left w:type="dxa" w:w="90"/>
+              <w:bottom w:type="dxa" w:w="50"/>
+              <w:right w:type="dxa" w:w="90"/>
+            </w:tcMar>
+            <w:vAlign w:val="center"/>
+          </w:tcPr>
+          <w:p>
+            <w:pPr>
+              <w:spacing w:after="0" w:before="0"/>
+            </w:pPr>
+            <w:r>
+              <w:rPr>
+                <w:rFonts w:ascii="Aptos Narrow" w:cs="Aptos Narrow" w:eastAsia="Aptos Narrow" w:hAnsi="Aptos Narrow"/>
+                <w:b/>
+                <w:bCs/>
+                <w:color w:val="FFFFFF"/>
+                <w:sz w:val="18"/>
+                <w:szCs w:val="18"/>
+              </w:rPr>
+              <w:t xml:space="preserve">VC Capabilities</w:t>
+            </w:r>
+          </w:p>
+        </w:tc>
+        <w:tc>
+          <w:tcPr>
+            <w:tcW w:type="dxa" w:w="11544"/>
+            <w:tcBorders>
+              <w:top w:val="single" w:color="808080" w:sz="4"/>
+              <w:left w:val="single" w:color="808080" w:sz="4"/>
+              <w:bottom w:val="single" w:color="808080" w:sz="4"/>
+              <w:right w:val="single" w:color="808080" w:sz="4"/>
+            </w:tcBorders>
+            <w:tcMar>
+              <w:top w:type="dxa" w:w="50"/>
+              <w:left w:type="dxa" w:w="90"/>
+              <w:bottom w:type="dxa" w:w="50"/>
+              <w:right w:type="dxa" w:w="90"/>
+            </w:tcMar>
+            <w:vAlign w:val="top"/>
+          </w:tcPr>
+          <w:p>
+            <w:pPr>
+              <w:spacing w:after="0" w:before="0"/>
+            </w:pPr>
+            <w:r>
+              <w:rPr>
+                <w:rFonts w:ascii="Aptos Narrow" w:cs="Aptos Narrow" w:eastAsia="Aptos Narrow" w:hAnsi="Aptos Narrow"/>
+                <w:sz w:val="16"/>
+                <w:szCs w:val="16"/>
+              </w:rPr>
+              <w:t xml:space="preserve">Personal and Social Capability: Social awareness and Management (Collaboration skills, Conflict), from the school continuum above.</w:t>
             </w:r>
           </w:p>
         </w:tc>
@@ -3235,7 +3688,7 @@
           <w:sz w:val="16"/>
           <w:szCs w:val="16"/>
         </w:rPr>
-        <w:t xml:space="preserve">Level 9 is the Year 9 expected level. Listening 10 and 11 in italics are the draft extension above the school continuum.</w:t>
+        <w:t xml:space="preserve">Level 9 is the Year 9 expected level. Listening 10 and 11 in italics are the draft extension above the school continuum. Personal and Social rows are the school's Personal and Social Capability continuum.</w:t>
       </w:r>
     </w:p>
     <w:sectPr>

</xml_diff>

<commit_message>
Glossary build as the shared-bank board; lesson 3a renamed to passage analysis practice
Co-Authored-By: Claude Fable 5.1 <noreply@anthropic.com>
Claude-Session: https://claude.ai/code/session_019gyiige9BuJUj3e3kcjvaS
</commit_message>
<xml_diff>
--- a/curious-incident/files/Curious Incident - Unit Planner.docx
+++ b/curious-incident/files/Curious Incident - Unit Planner.docx
@@ -283,7 +283,7 @@
               </w:rPr>
               <w:t xml:space="preserve">use interaction skills to discuss opinions regarding texts that have different purposes and audiences, analysing how language features position an audience to respond in particular ways </w:t>
             </w:r>
-            <w:hyperlink w:history="1" r:id="rIdrvpqgai5fmrhdoint0u5t">
+            <w:hyperlink w:history="1" r:id="rId9csjdrypgnqjdhpr8klpj">
               <w:r>
                 <w:rPr>
                   <w:rFonts w:ascii="Aptos Narrow" w:cs="Aptos Narrow" w:eastAsia="Aptos Narrow" w:hAnsi="Aptos Narrow"/>
@@ -314,7 +314,7 @@
               </w:rPr>
               <w:t xml:space="preserve">deliver structured spoken texts for particular purposes, demonstrating different levels of formality in consideration of audience, using features of voice and multimodal or digital elements </w:t>
             </w:r>
-            <w:hyperlink w:history="1" r:id="rId-d9kgkathxou3k1ppqtdc">
+            <w:hyperlink w:history="1" r:id="rIdkyonrcmtwbkst40ngzypt">
               <w:r>
                 <w:rPr>
                   <w:rFonts w:ascii="Aptos Narrow" w:cs="Aptos Narrow" w:eastAsia="Aptos Narrow" w:hAnsi="Aptos Narrow"/>
@@ -827,7 +827,7 @@
               </w:rPr>
               <w:t xml:space="preserve">Session 1 · Personal response (</w:t>
             </w:r>
-            <w:hyperlink w:history="1" r:id="rIdftpa0b4qvhcqsflfv0mrr">
+            <w:hyperlink w:history="1" r:id="rIdh0rf_nbm2umsnj54ilwqs">
               <w:r>
                 <w:rPr>
                   <w:rFonts w:ascii="Aptos Narrow" w:cs="Aptos Narrow" w:eastAsia="Aptos Narrow" w:hAnsi="Aptos Narrow"/>
@@ -873,7 +873,7 @@
               </w:rPr>
               <w:t xml:space="preserve">Session 2 · I couldn't disagree more (</w:t>
             </w:r>
-            <w:hyperlink w:history="1" r:id="rIdov7z9ixtdouqshf59kxno">
+            <w:hyperlink w:history="1" r:id="rIdz9z7iw4rcgzyerrg0bhge">
               <w:r>
                 <w:rPr>
                   <w:rFonts w:ascii="Aptos Narrow" w:cs="Aptos Narrow" w:eastAsia="Aptos Narrow" w:hAnsi="Aptos Narrow"/>
@@ -919,7 +919,7 @@
               </w:rPr>
               <w:t xml:space="preserve">Session 3 · Passage analysis panel (</w:t>
             </w:r>
-            <w:hyperlink w:history="1" r:id="rIdx28utfvxf4tkvup8lxfub">
+            <w:hyperlink w:history="1" r:id="rIdyd4nz_ob10udsanptdbvy">
               <w:r>
                 <w:rPr>
                   <w:rFonts w:ascii="Aptos Narrow" w:cs="Aptos Narrow" w:eastAsia="Aptos Narrow" w:hAnsi="Aptos Narrow"/>
@@ -940,7 +940,7 @@
               </w:rPr>
               <w:t xml:space="preserve">) and the completed Speaking and Listening Folio: Table 1 record on the front page, three strands, against the continuum (</w:t>
             </w:r>
-            <w:hyperlink w:history="1" r:id="rIdok6xwlduigne49xdq791e">
+            <w:hyperlink w:history="1" r:id="rIdieedvjkslydacjp-ovwzo">
               <w:r>
                 <w:rPr>
                   <w:rFonts w:ascii="Aptos Narrow" w:cs="Aptos Narrow" w:eastAsia="Aptos Narrow" w:hAnsi="Aptos Narrow"/>
@@ -961,7 +961,7 @@
               </w:rPr>
               <w:t xml:space="preserve"> · </w:t>
             </w:r>
-            <w:hyperlink w:history="1" r:id="rId95urexeptkcti1g4jjdlp">
+            <w:hyperlink w:history="1" r:id="rIdxrhvajtwfsje4-kiwopjx">
               <w:r>
                 <w:rPr>
                   <w:rFonts w:ascii="Aptos Narrow" w:cs="Aptos Narrow" w:eastAsia="Aptos Narrow" w:hAnsi="Aptos Narrow"/>
@@ -1213,7 +1213,7 @@
               </w:rPr>
               <w:t xml:space="preserve">Groups made on the </w:t>
             </w:r>
-            <w:hyperlink w:history="1" r:id="rId3d-6k3ybnbptqybbueyxf">
+            <w:hyperlink w:history="1" r:id="rIdwndit1r7ypoxfaj46_6v8">
               <w:r>
                 <w:rPr>
                   <w:rFonts w:ascii="Aptos Narrow" w:cs="Aptos Narrow" w:eastAsia="Aptos Narrow" w:hAnsi="Aptos Narrow"/>
@@ -1234,7 +1234,7 @@
               </w:rPr>
               <w:t xml:space="preserve">. Folio handed out: </w:t>
             </w:r>
-            <w:hyperlink w:history="1" r:id="rIduzjuakcncjnulj0fsmloz">
+            <w:hyperlink w:history="1" r:id="rIdzgx62n27arqgxuaiv_omd">
               <w:r>
                 <w:rPr>
                   <w:rFonts w:ascii="Aptos Narrow" w:cs="Aptos Narrow" w:eastAsia="Aptos Narrow" w:hAnsi="Aptos Narrow"/>
@@ -1255,7 +1255,7 @@
               </w:rPr>
               <w:t xml:space="preserve">. Key vocabulary: </w:t>
             </w:r>
-            <w:hyperlink w:history="1" r:id="rIdifhfrjmcq3a9ulqjy83h-">
+            <w:hyperlink w:history="1" r:id="rIdnw-h5zxg845q0nmtmw8b2">
               <w:r>
                 <w:rPr>
                   <w:rFonts w:ascii="Aptos Narrow" w:cs="Aptos Narrow" w:eastAsia="Aptos Narrow" w:hAnsi="Aptos Narrow"/>
@@ -1390,7 +1390,7 @@
               </w:rPr>
               <w:t xml:space="preserve"> · </w:t>
             </w:r>
-            <w:hyperlink w:history="1" r:id="rIdlfzxcv1vlee3gzqtxlpfl">
+            <w:hyperlink w:history="1" r:id="rId4b3evmkydjpsqoih8-hid">
               <w:r>
                 <w:rPr>
                   <w:rFonts w:ascii="Aptos Narrow" w:cs="Aptos Narrow" w:eastAsia="Aptos Narrow" w:hAnsi="Aptos Narrow"/>
@@ -1411,7 +1411,7 @@
               </w:rPr>
               <w:t xml:space="preserve"> · </w:t>
             </w:r>
-            <w:hyperlink w:history="1" r:id="rIdsfvvbbp15-mah0zaxyaof">
+            <w:hyperlink w:history="1" r:id="rIdmt2xi8mcrpevc8gceri8d">
               <w:r>
                 <w:rPr>
                   <w:rFonts w:ascii="Aptos Narrow" w:cs="Aptos Narrow" w:eastAsia="Aptos Narrow" w:hAnsi="Aptos Narrow"/>
@@ -1432,7 +1432,7 @@
               </w:rPr>
               <w:t xml:space="preserve"> · </w:t>
             </w:r>
-            <w:hyperlink w:history="1" r:id="rIdb-flnl-eddrtmjyvnkb9g">
+            <w:hyperlink w:history="1" r:id="rIdnyzo_seavuvsmq7dk4s1o">
               <w:r>
                 <w:rPr>
                   <w:rFonts w:ascii="Aptos Narrow" w:cs="Aptos Narrow" w:eastAsia="Aptos Narrow" w:hAnsi="Aptos Narrow"/>
@@ -1652,7 +1652,7 @@
               </w:rPr>
               <w:t xml:space="preserve"> · </w:t>
             </w:r>
-            <w:hyperlink w:history="1" r:id="rIdqfn7itp9fyj8s0g2u5lkt">
+            <w:hyperlink w:history="1" r:id="rId-6cbpwmqyoybrwpzyc3nf">
               <w:r>
                 <w:rPr>
                   <w:rFonts w:ascii="Aptos Narrow" w:cs="Aptos Narrow" w:eastAsia="Aptos Narrow" w:hAnsi="Aptos Narrow"/>
@@ -1673,7 +1673,7 @@
               </w:rPr>
               <w:t xml:space="preserve"> · </w:t>
             </w:r>
-            <w:hyperlink w:history="1" r:id="rIdaiqc1uiye4bqymnt5uvfj">
+            <w:hyperlink w:history="1" r:id="rId6cpipt6x2uxebrl9m4zdt">
               <w:r>
                 <w:rPr>
                   <w:rFonts w:ascii="Aptos Narrow" w:cs="Aptos Narrow" w:eastAsia="Aptos Narrow" w:hAnsi="Aptos Narrow"/>
@@ -1694,7 +1694,7 @@
               </w:rPr>
               <w:t xml:space="preserve"> · </w:t>
             </w:r>
-            <w:hyperlink w:history="1" r:id="rIdvjiuh06tipcewxvyjmeyx">
+            <w:hyperlink w:history="1" r:id="rIdfjx6qisodcxtrtkvxlgby">
               <w:r>
                 <w:rPr>
                   <w:rFonts w:ascii="Aptos Narrow" w:cs="Aptos Narrow" w:eastAsia="Aptos Narrow" w:hAnsi="Aptos Narrow"/>
@@ -1818,7 +1818,7 @@
                 <w:sz w:val="20"/>
                 <w:szCs w:val="20"/>
               </w:rPr>
-              <w:t xml:space="preserve">Passage panel practice</w:t>
+              <w:t xml:space="preserve">Passage analysis practice</w:t>
             </w:r>
             <w:r>
               <w:rPr>
@@ -1829,7 +1829,7 @@
               </w:rPr>
               <w:t xml:space="preserve"> · </w:t>
             </w:r>
-            <w:hyperlink w:history="1" r:id="rIduprblu5diqttwi4pg44fu">
+            <w:hyperlink w:history="1" r:id="rIdp8nfqzedqv-ucjnh_mv2c">
               <w:r>
                 <w:rPr>
                   <w:rFonts w:ascii="Aptos Narrow" w:cs="Aptos Narrow" w:eastAsia="Aptos Narrow" w:hAnsi="Aptos Narrow"/>
@@ -1850,7 +1850,7 @@
               </w:rPr>
               <w:t xml:space="preserve"> · </w:t>
             </w:r>
-            <w:hyperlink w:history="1" r:id="rIdmjlzzjfdwaidinpdhgqf-">
+            <w:hyperlink w:history="1" r:id="rIdl430tts4sd9gbrcayi4ea">
               <w:r>
                 <w:rPr>
                   <w:rFonts w:ascii="Aptos Narrow" w:cs="Aptos Narrow" w:eastAsia="Aptos Narrow" w:hAnsi="Aptos Narrow"/>
@@ -1859,7 +1859,7 @@
                   <w:szCs w:val="20"/>
                   <w:u w:val="single"/>
                 </w:rPr>
-                <w:t xml:space="preserve">Panel practice worksheet</w:t>
+                <w:t xml:space="preserve">Passage analysis worksheet</w:t>
               </w:r>
             </w:hyperlink>
           </w:p>
@@ -1985,7 +1985,7 @@
               </w:rPr>
               <w:t xml:space="preserve"> · </w:t>
             </w:r>
-            <w:hyperlink w:history="1" r:id="rIdigwn8srwuwklvxptzumkb">
+            <w:hyperlink w:history="1" r:id="rIdkln4b_74uqxke_shb0k3e">
               <w:r>
                 <w:rPr>
                   <w:rFonts w:ascii="Aptos Narrow" w:cs="Aptos Narrow" w:eastAsia="Aptos Narrow" w:hAnsi="Aptos Narrow"/>
@@ -2006,7 +2006,7 @@
               </w:rPr>
               <w:t xml:space="preserve"> · </w:t>
             </w:r>
-            <w:hyperlink w:history="1" r:id="rIdgmbeivfcjxiwqmx8z8fik">
+            <w:hyperlink w:history="1" r:id="rIdxiqqla7nabr3hzfjrmwoh">
               <w:r>
                 <w:rPr>
                   <w:rFonts w:ascii="Aptos Narrow" w:cs="Aptos Narrow" w:eastAsia="Aptos Narrow" w:hAnsi="Aptos Narrow"/>
@@ -2027,7 +2027,7 @@
               </w:rPr>
               <w:t xml:space="preserve"> · </w:t>
             </w:r>
-            <w:hyperlink w:history="1" r:id="rIdexorkdm_tj4evozma5_ex">
+            <w:hyperlink w:history="1" r:id="rIdjyhe9thyhj6zp5jlupqex">
               <w:r>
                 <w:rPr>
                   <w:rFonts w:ascii="Aptos Narrow" w:cs="Aptos Narrow" w:eastAsia="Aptos Narrow" w:hAnsi="Aptos Narrow"/>
@@ -2053,7 +2053,7 @@
               </w:rPr>
               <w:t xml:space="preserve">Folio collected and scored: </w:t>
             </w:r>
-            <w:hyperlink w:history="1" r:id="rId_zk2xazzv-ekel1hrcpla">
+            <w:hyperlink w:history="1" r:id="rIdhloay_ytqet6muklo7eev">
               <w:r>
                 <w:rPr>
                   <w:rFonts w:ascii="Aptos Narrow" w:cs="Aptos Narrow" w:eastAsia="Aptos Narrow" w:hAnsi="Aptos Narrow"/>
@@ -2084,7 +2084,7 @@
         </w:rPr>
         <w:t xml:space="preserve">Everything in one place: </w:t>
       </w:r>
-      <w:hyperlink w:history="1" r:id="rIdko5-t6n7owetvhv3ggjmb">
+      <w:hyperlink w:history="1" r:id="rId5sx9etnligfjewlpjva2p">
         <w:r>
           <w:rPr>
             <w:rFonts w:ascii="Aptos Narrow" w:cs="Aptos Narrow" w:eastAsia="Aptos Narrow" w:hAnsi="Aptos Narrow"/>
@@ -2105,7 +2105,7 @@
         </w:rPr>
         <w:t xml:space="preserve"> · </w:t>
       </w:r>
-      <w:hyperlink w:history="1" r:id="rIdrenc8ifvjuxj9jvtvydot">
+      <w:hyperlink w:history="1" r:id="rIdbs_yckdqecigwev97b1lt">
         <w:r>
           <w:rPr>
             <w:rFonts w:ascii="Aptos Narrow" w:cs="Aptos Narrow" w:eastAsia="Aptos Narrow" w:hAnsi="Aptos Narrow"/>
@@ -2126,7 +2126,7 @@
         </w:rPr>
         <w:t xml:space="preserve"> · </w:t>
       </w:r>
-      <w:hyperlink w:history="1" r:id="rIdc3bfjm-_ykagbndn_sb51">
+      <w:hyperlink w:history="1" r:id="rIdmzoz21xmu1w9qyul4_nyp">
         <w:r>
           <w:rPr>
             <w:rFonts w:ascii="Aptos Narrow" w:cs="Aptos Narrow" w:eastAsia="Aptos Narrow" w:hAnsi="Aptos Narrow"/>

</xml_diff>

<commit_message>
Lesson 3b on the site
Co-Authored-By: Claude Fable 5.1 <noreply@anthropic.com>
Claude-Session: https://claude.ai/code/session_019gyiige9BuJUj3e3kcjvaS
</commit_message>
<xml_diff>
--- a/curious-incident/files/Curious Incident - Unit Planner.docx
+++ b/curious-incident/files/Curious Incident - Unit Planner.docx
@@ -283,7 +283,7 @@
               </w:rPr>
               <w:t xml:space="preserve">use interaction skills to discuss opinions regarding texts that have different purposes and audiences, analysing how language features position an audience to respond in particular ways </w:t>
             </w:r>
-            <w:hyperlink w:history="1" r:id="rId9csjdrypgnqjdhpr8klpj">
+            <w:hyperlink w:history="1" r:id="rIdozg8bw2o49jgrt5i41po5">
               <w:r>
                 <w:rPr>
                   <w:rFonts w:ascii="Aptos Narrow" w:cs="Aptos Narrow" w:eastAsia="Aptos Narrow" w:hAnsi="Aptos Narrow"/>
@@ -314,7 +314,7 @@
               </w:rPr>
               <w:t xml:space="preserve">deliver structured spoken texts for particular purposes, demonstrating different levels of formality in consideration of audience, using features of voice and multimodal or digital elements </w:t>
             </w:r>
-            <w:hyperlink w:history="1" r:id="rIdkyonrcmtwbkst40ngzypt">
+            <w:hyperlink w:history="1" r:id="rIdf-pme_br3f7qncjffmgo5">
               <w:r>
                 <w:rPr>
                   <w:rFonts w:ascii="Aptos Narrow" w:cs="Aptos Narrow" w:eastAsia="Aptos Narrow" w:hAnsi="Aptos Narrow"/>
@@ -827,7 +827,7 @@
               </w:rPr>
               <w:t xml:space="preserve">Session 1 · Personal response (</w:t>
             </w:r>
-            <w:hyperlink w:history="1" r:id="rIdh0rf_nbm2umsnj54ilwqs">
+            <w:hyperlink w:history="1" r:id="rIdhkskiqmbv-yzidzidi9a3">
               <w:r>
                 <w:rPr>
                   <w:rFonts w:ascii="Aptos Narrow" w:cs="Aptos Narrow" w:eastAsia="Aptos Narrow" w:hAnsi="Aptos Narrow"/>
@@ -873,7 +873,7 @@
               </w:rPr>
               <w:t xml:space="preserve">Session 2 · I couldn't disagree more (</w:t>
             </w:r>
-            <w:hyperlink w:history="1" r:id="rIdz9z7iw4rcgzyerrg0bhge">
+            <w:hyperlink w:history="1" r:id="rIdkm2-tv9opwv1lxuwekmab">
               <w:r>
                 <w:rPr>
                   <w:rFonts w:ascii="Aptos Narrow" w:cs="Aptos Narrow" w:eastAsia="Aptos Narrow" w:hAnsi="Aptos Narrow"/>
@@ -919,7 +919,7 @@
               </w:rPr>
               <w:t xml:space="preserve">Session 3 · Passage analysis panel (</w:t>
             </w:r>
-            <w:hyperlink w:history="1" r:id="rIdyd4nz_ob10udsanptdbvy">
+            <w:hyperlink w:history="1" r:id="rIdpymxiu2ywemt1gsmiysdq">
               <w:r>
                 <w:rPr>
                   <w:rFonts w:ascii="Aptos Narrow" w:cs="Aptos Narrow" w:eastAsia="Aptos Narrow" w:hAnsi="Aptos Narrow"/>
@@ -940,7 +940,7 @@
               </w:rPr>
               <w:t xml:space="preserve">) and the completed Speaking and Listening Folio: Table 1 record on the front page, three strands, against the continuum (</w:t>
             </w:r>
-            <w:hyperlink w:history="1" r:id="rIdieedvjkslydacjp-ovwzo">
+            <w:hyperlink w:history="1" r:id="rIdejaxgvs6cjcazflx8mzek">
               <w:r>
                 <w:rPr>
                   <w:rFonts w:ascii="Aptos Narrow" w:cs="Aptos Narrow" w:eastAsia="Aptos Narrow" w:hAnsi="Aptos Narrow"/>
@@ -961,7 +961,7 @@
               </w:rPr>
               <w:t xml:space="preserve"> · </w:t>
             </w:r>
-            <w:hyperlink w:history="1" r:id="rIdxrhvajtwfsje4-kiwopjx">
+            <w:hyperlink w:history="1" r:id="rIdrzxy9mm3rf3rxw76li8ix">
               <w:r>
                 <w:rPr>
                   <w:rFonts w:ascii="Aptos Narrow" w:cs="Aptos Narrow" w:eastAsia="Aptos Narrow" w:hAnsi="Aptos Narrow"/>
@@ -1213,7 +1213,7 @@
               </w:rPr>
               <w:t xml:space="preserve">Groups made on the </w:t>
             </w:r>
-            <w:hyperlink w:history="1" r:id="rIdwndit1r7ypoxfaj46_6v8">
+            <w:hyperlink w:history="1" r:id="rIdj0z7yzd1yxvg-6txrusx_">
               <w:r>
                 <w:rPr>
                   <w:rFonts w:ascii="Aptos Narrow" w:cs="Aptos Narrow" w:eastAsia="Aptos Narrow" w:hAnsi="Aptos Narrow"/>
@@ -1234,7 +1234,7 @@
               </w:rPr>
               <w:t xml:space="preserve">. Folio handed out: </w:t>
             </w:r>
-            <w:hyperlink w:history="1" r:id="rIdzgx62n27arqgxuaiv_omd">
+            <w:hyperlink w:history="1" r:id="rId4zgrzqge6eshel7-kl830">
               <w:r>
                 <w:rPr>
                   <w:rFonts w:ascii="Aptos Narrow" w:cs="Aptos Narrow" w:eastAsia="Aptos Narrow" w:hAnsi="Aptos Narrow"/>
@@ -1255,7 +1255,7 @@
               </w:rPr>
               <w:t xml:space="preserve">. Key vocabulary: </w:t>
             </w:r>
-            <w:hyperlink w:history="1" r:id="rIdnw-h5zxg845q0nmtmw8b2">
+            <w:hyperlink w:history="1" r:id="rIde72ny9z764ek3xvs78abw">
               <w:r>
                 <w:rPr>
                   <w:rFonts w:ascii="Aptos Narrow" w:cs="Aptos Narrow" w:eastAsia="Aptos Narrow" w:hAnsi="Aptos Narrow"/>
@@ -1390,7 +1390,7 @@
               </w:rPr>
               <w:t xml:space="preserve"> · </w:t>
             </w:r>
-            <w:hyperlink w:history="1" r:id="rId4b3evmkydjpsqoih8-hid">
+            <w:hyperlink w:history="1" r:id="rIdwmbys8ngvf1i8ybd6nb1v">
               <w:r>
                 <w:rPr>
                   <w:rFonts w:ascii="Aptos Narrow" w:cs="Aptos Narrow" w:eastAsia="Aptos Narrow" w:hAnsi="Aptos Narrow"/>
@@ -1411,7 +1411,7 @@
               </w:rPr>
               <w:t xml:space="preserve"> · </w:t>
             </w:r>
-            <w:hyperlink w:history="1" r:id="rIdmt2xi8mcrpevc8gceri8d">
+            <w:hyperlink w:history="1" r:id="rIddwiubjjo-iypy6q-ylcp8">
               <w:r>
                 <w:rPr>
                   <w:rFonts w:ascii="Aptos Narrow" w:cs="Aptos Narrow" w:eastAsia="Aptos Narrow" w:hAnsi="Aptos Narrow"/>
@@ -1432,7 +1432,7 @@
               </w:rPr>
               <w:t xml:space="preserve"> · </w:t>
             </w:r>
-            <w:hyperlink w:history="1" r:id="rIdnyzo_seavuvsmq7dk4s1o">
+            <w:hyperlink w:history="1" r:id="rIde-k26casuv3fqaa-yrkvo">
               <w:r>
                 <w:rPr>
                   <w:rFonts w:ascii="Aptos Narrow" w:cs="Aptos Narrow" w:eastAsia="Aptos Narrow" w:hAnsi="Aptos Narrow"/>
@@ -1652,7 +1652,7 @@
               </w:rPr>
               <w:t xml:space="preserve"> · </w:t>
             </w:r>
-            <w:hyperlink w:history="1" r:id="rId-6cbpwmqyoybrwpzyc3nf">
+            <w:hyperlink w:history="1" r:id="rIdenhf6wihorxyhqobkygmx">
               <w:r>
                 <w:rPr>
                   <w:rFonts w:ascii="Aptos Narrow" w:cs="Aptos Narrow" w:eastAsia="Aptos Narrow" w:hAnsi="Aptos Narrow"/>
@@ -1673,7 +1673,7 @@
               </w:rPr>
               <w:t xml:space="preserve"> · </w:t>
             </w:r>
-            <w:hyperlink w:history="1" r:id="rId6cpipt6x2uxebrl9m4zdt">
+            <w:hyperlink w:history="1" r:id="rIdmofpblr5gtvuosz2sbufd">
               <w:r>
                 <w:rPr>
                   <w:rFonts w:ascii="Aptos Narrow" w:cs="Aptos Narrow" w:eastAsia="Aptos Narrow" w:hAnsi="Aptos Narrow"/>
@@ -1694,7 +1694,7 @@
               </w:rPr>
               <w:t xml:space="preserve"> · </w:t>
             </w:r>
-            <w:hyperlink w:history="1" r:id="rIdfjx6qisodcxtrtkvxlgby">
+            <w:hyperlink w:history="1" r:id="rIdd6-mrehbwmwbxallb5j-z">
               <w:r>
                 <w:rPr>
                   <w:rFonts w:ascii="Aptos Narrow" w:cs="Aptos Narrow" w:eastAsia="Aptos Narrow" w:hAnsi="Aptos Narrow"/>
@@ -1829,7 +1829,7 @@
               </w:rPr>
               <w:t xml:space="preserve"> · </w:t>
             </w:r>
-            <w:hyperlink w:history="1" r:id="rIdp8nfqzedqv-ucjnh_mv2c">
+            <w:hyperlink w:history="1" r:id="rIdlh15gmuv77wpis-8wknky">
               <w:r>
                 <w:rPr>
                   <w:rFonts w:ascii="Aptos Narrow" w:cs="Aptos Narrow" w:eastAsia="Aptos Narrow" w:hAnsi="Aptos Narrow"/>
@@ -1850,7 +1850,7 @@
               </w:rPr>
               <w:t xml:space="preserve"> · </w:t>
             </w:r>
-            <w:hyperlink w:history="1" r:id="rIdl430tts4sd9gbrcayi4ea">
+            <w:hyperlink w:history="1" r:id="rIdubdwgji8vzwsu7bg5s8gb">
               <w:r>
                 <w:rPr>
                   <w:rFonts w:ascii="Aptos Narrow" w:cs="Aptos Narrow" w:eastAsia="Aptos Narrow" w:hAnsi="Aptos Narrow"/>
@@ -1863,6 +1863,64 @@
               </w:r>
             </w:hyperlink>
           </w:p>
+          <w:p>
+            <w:pPr>
+              <w:spacing w:after="20" w:before="0"/>
+            </w:pPr>
+            <w:r>
+              <w:rPr>
+                <w:rFonts w:ascii="Aptos Narrow" w:cs="Aptos Narrow" w:eastAsia="Aptos Narrow" w:hAnsi="Aptos Narrow"/>
+                <w:b/>
+                <w:bCs/>
+                <w:color w:val="1F1F1F"/>
+                <w:sz w:val="20"/>
+                <w:szCs w:val="20"/>
+              </w:rPr>
+              <w:t xml:space="preserve">Passage panel talk</w:t>
+            </w:r>
+            <w:r>
+              <w:rPr>
+                <w:rFonts w:ascii="Aptos Narrow" w:cs="Aptos Narrow" w:eastAsia="Aptos Narrow" w:hAnsi="Aptos Narrow"/>
+                <w:color w:val="1F1F1F"/>
+                <w:sz w:val="20"/>
+                <w:szCs w:val="20"/>
+              </w:rPr>
+              <w:t xml:space="preserve"> · </w:t>
+            </w:r>
+            <w:hyperlink w:history="1" r:id="rId0xla8uixmm8rwnsvkodnh">
+              <w:r>
+                <w:rPr>
+                  <w:rFonts w:ascii="Aptos Narrow" w:cs="Aptos Narrow" w:eastAsia="Aptos Narrow" w:hAnsi="Aptos Narrow"/>
+                  <w:color w:val="0563C1"/>
+                  <w:sz w:val="20"/>
+                  <w:szCs w:val="20"/>
+                  <w:u w:val="single"/>
+                </w:rPr>
+                <w:t xml:space="preserve">Lesson plan 3b</w:t>
+              </w:r>
+            </w:hyperlink>
+            <w:r>
+              <w:rPr>
+                <w:rFonts w:ascii="Aptos Narrow" w:cs="Aptos Narrow" w:eastAsia="Aptos Narrow" w:hAnsi="Aptos Narrow"/>
+                <w:color w:val="1F1F1F"/>
+                <w:sz w:val="20"/>
+                <w:szCs w:val="20"/>
+              </w:rPr>
+              <w:t xml:space="preserve"> · </w:t>
+            </w:r>
+            <w:hyperlink w:history="1" r:id="rId0aaqt4igkqgmbeniistmx">
+              <w:r>
+                <w:rPr>
+                  <w:rFonts w:ascii="Aptos Narrow" w:cs="Aptos Narrow" w:eastAsia="Aptos Narrow" w:hAnsi="Aptos Narrow"/>
+                  <w:color w:val="0563C1"/>
+                  <w:sz w:val="20"/>
+                  <w:szCs w:val="20"/>
+                  <w:u w:val="single"/>
+                </w:rPr>
+                <w:t xml:space="preserve">Table talk · Session 3</w:t>
+              </w:r>
+            </w:hyperlink>
+          </w:p>
         </w:tc>
       </w:tr>
       <w:tr>
@@ -1985,7 +2043,7 @@
               </w:rPr>
               <w:t xml:space="preserve"> · </w:t>
             </w:r>
-            <w:hyperlink w:history="1" r:id="rIdkln4b_74uqxke_shb0k3e">
+            <w:hyperlink w:history="1" r:id="rIdejvmggw8na_oka7yzf7h7">
               <w:r>
                 <w:rPr>
                   <w:rFonts w:ascii="Aptos Narrow" w:cs="Aptos Narrow" w:eastAsia="Aptos Narrow" w:hAnsi="Aptos Narrow"/>
@@ -2006,7 +2064,7 @@
               </w:rPr>
               <w:t xml:space="preserve"> · </w:t>
             </w:r>
-            <w:hyperlink w:history="1" r:id="rIdxiqqla7nabr3hzfjrmwoh">
+            <w:hyperlink w:history="1" r:id="rIdgh3hidgu4fi96tvvdhd3o">
               <w:r>
                 <w:rPr>
                   <w:rFonts w:ascii="Aptos Narrow" w:cs="Aptos Narrow" w:eastAsia="Aptos Narrow" w:hAnsi="Aptos Narrow"/>
@@ -2027,7 +2085,7 @@
               </w:rPr>
               <w:t xml:space="preserve"> · </w:t>
             </w:r>
-            <w:hyperlink w:history="1" r:id="rIdjyhe9thyhj6zp5jlupqex">
+            <w:hyperlink w:history="1" r:id="rIdlpdi89piip1wdl38jmoqp">
               <w:r>
                 <w:rPr>
                   <w:rFonts w:ascii="Aptos Narrow" w:cs="Aptos Narrow" w:eastAsia="Aptos Narrow" w:hAnsi="Aptos Narrow"/>
@@ -2053,7 +2111,7 @@
               </w:rPr>
               <w:t xml:space="preserve">Folio collected and scored: </w:t>
             </w:r>
-            <w:hyperlink w:history="1" r:id="rIdhloay_ytqet6muklo7eev">
+            <w:hyperlink w:history="1" r:id="rIdbuotflykzyhyce5iftwqj">
               <w:r>
                 <w:rPr>
                   <w:rFonts w:ascii="Aptos Narrow" w:cs="Aptos Narrow" w:eastAsia="Aptos Narrow" w:hAnsi="Aptos Narrow"/>
@@ -2084,7 +2142,7 @@
         </w:rPr>
         <w:t xml:space="preserve">Everything in one place: </w:t>
       </w:r>
-      <w:hyperlink w:history="1" r:id="rId5sx9etnligfjewlpjva2p">
+      <w:hyperlink w:history="1" r:id="rIdz1rnuvqwtexgnq4v1vp9p">
         <w:r>
           <w:rPr>
             <w:rFonts w:ascii="Aptos Narrow" w:cs="Aptos Narrow" w:eastAsia="Aptos Narrow" w:hAnsi="Aptos Narrow"/>
@@ -2105,7 +2163,7 @@
         </w:rPr>
         <w:t xml:space="preserve"> · </w:t>
       </w:r>
-      <w:hyperlink w:history="1" r:id="rIdbs_yckdqecigwev97b1lt">
+      <w:hyperlink w:history="1" r:id="rId3shwemxe5usybbgajnurs">
         <w:r>
           <w:rPr>
             <w:rFonts w:ascii="Aptos Narrow" w:cs="Aptos Narrow" w:eastAsia="Aptos Narrow" w:hAnsi="Aptos Narrow"/>
@@ -2126,7 +2184,7 @@
         </w:rPr>
         <w:t xml:space="preserve"> · </w:t>
       </w:r>
-      <w:hyperlink w:history="1" r:id="rIdmzoz21xmu1w9qyul4_nyp">
+      <w:hyperlink w:history="1" r:id="rIdr0oxtnjrbitangdmde_1i">
         <w:r>
           <w:rPr>
             <w:rFonts w:ascii="Aptos Narrow" w:cs="Aptos Narrow" w:eastAsia="Aptos Narrow" w:hAnsi="Aptos Narrow"/>

</xml_diff>